<commit_message>
Clean up: remove temp files, ignore HF Space copy
</commit_message>
<xml_diff>
--- a/docs/report.docx
+++ b/docs/report.docx
@@ -89,8 +89,14 @@
       <w:pPr>
         <w:pStyle w:val="Heading1"/>
         <w:ind w:firstLine="360"/>
-      </w:pPr>
-      <w:r>
+        <w:rPr>
+          <w:color w:val="215E99" w:themeColor="text2" w:themeTint="BF"/>
+        </w:rPr>
+      </w:pPr>
+      <w:r>
+        <w:rPr>
+          <w:color w:val="215E99" w:themeColor="text2" w:themeTint="BF"/>
+        </w:rPr>
         <w:t>1. Introduction</w:t>
       </w:r>
     </w:p>
@@ -103,9 +109,11 @@
       <w:r>
         <w:t xml:space="preserve">Pasture biomass is a key input for grazing management: knowing how much dry matter is available helps farmers decide when and how to graze livestock without over- or under-using a paddock. Measuring biomass directly is </w:t>
       </w:r>
-      <w:r>
-        <w:t>labor-intensive</w:t>
-      </w:r>
+      <w:proofErr w:type="spellStart"/>
+      <w:r>
+        <w:t>labour-intensive</w:t>
+      </w:r>
+      <w:proofErr w:type="spellEnd"/>
       <w:r>
         <w:t>, so estimating it from photographs is attractive — a farmer could photograph a field and get an instant estimate.</w:t>
       </w:r>
@@ -117,10 +125,10 @@
         <w:jc w:val="both"/>
       </w:pPr>
       <w:r>
-        <w:t xml:space="preserve">We use the CSIRO Image2Biomass dataset </w:t>
-      </w:r>
-      <w:r>
-        <w:t>(</w:t>
+        <w:t xml:space="preserve">We use the CSIRO Image2Biomass </w:t>
+      </w:r>
+      <w:r>
+        <w:t>dataset (</w:t>
       </w:r>
       <w:hyperlink r:id="rId7" w:history="1">
         <w:r>
@@ -131,40 +139,41 @@
         </w:r>
       </w:hyperlink>
       <w:r>
-        <w:t xml:space="preserve">): </w:t>
-      </w:r>
-      <w:r>
-        <w:t xml:space="preserve">where each 70x30 cm quadrat photograph </w:t>
-      </w:r>
-      <w:proofErr w:type="gramStart"/>
-      <w:r>
-        <w:t>is paired</w:t>
-      </w:r>
-      <w:proofErr w:type="gramEnd"/>
-      <w:r>
-        <w:t xml:space="preserve"> with five ground-truth biomass targets in grams: green, dead, clover, GDM (green dry matter), and total dry matter.</w:t>
-      </w:r>
-    </w:p>
-    <w:p>
-      <w:pPr>
-        <w:spacing w:after="140"/>
-        <w:ind w:firstLine="360"/>
-        <w:jc w:val="both"/>
-        <w:rPr>
-          <w:lang w:val="ru-RU"/>
-        </w:rPr>
-      </w:pPr>
-      <w:r>
-        <w:t xml:space="preserve">Beyond raw prediction, our central question is a modality comparison: how much does the image add over two cheap ground measurements already available in the data — NDVI and pasture height? This reframes the project from "train a CNN" to "quantify whether expensive pixel analysis beats cheap field measurements", which is both more scientifically interesting and more </w:t>
-      </w:r>
-      <w:proofErr w:type="gramStart"/>
-      <w:r>
-        <w:t>practically relevant</w:t>
-      </w:r>
-      <w:proofErr w:type="gramEnd"/>
-      <w:r>
-        <w:t>.</w:t>
-      </w:r>
+        <w:t>)</w:t>
+      </w:r>
+      <w:r>
+        <w:t xml:space="preserve">, </w:t>
+      </w:r>
+      <w:r>
+        <w:t>where each 70x30 cm quadrat photograph is paired with five ground-truth biomass targets in grams: green, dead, clover, GDM (green dry matter), and total dry matter.</w:t>
+      </w:r>
+    </w:p>
+    <w:p>
+      <w:pPr>
+        <w:spacing w:after="140"/>
+        <w:ind w:firstLine="360"/>
+        <w:jc w:val="both"/>
+      </w:pPr>
+      <w:r>
+        <w:t xml:space="preserve">Beyond raw prediction, our central question is a </w:t>
+      </w:r>
+      <w:r>
+        <w:rPr>
+          <w:b/>
+          <w:bCs/>
+        </w:rPr>
+        <w:t>modality comparison</w:t>
+      </w:r>
+      <w:r>
+        <w:t>: how much does the image add over two cheap ground measurements already available in the data — NDVI and pasture height? This reframes the project from "train a CNN" to "quantify whether expensive pixel analysis beats cheap field measurements", which is both more scientifically interesting and more practically relevant.</w:t>
+      </w:r>
+    </w:p>
+    <w:p>
+      <w:pPr>
+        <w:spacing w:after="140"/>
+        <w:ind w:firstLine="360"/>
+        <w:jc w:val="both"/>
+      </w:pPr>
     </w:p>
     <w:p>
       <w:pPr>
@@ -250,8 +259,14 @@
       <w:pPr>
         <w:pStyle w:val="Heading1"/>
         <w:ind w:firstLine="360"/>
-      </w:pPr>
-      <w:r>
+        <w:rPr>
+          <w:color w:val="215E99" w:themeColor="text2" w:themeTint="BF"/>
+        </w:rPr>
+      </w:pPr>
+      <w:r>
+        <w:rPr>
+          <w:color w:val="215E99" w:themeColor="text2" w:themeTint="BF"/>
+        </w:rPr>
         <w:t>2. Data</w:t>
       </w:r>
     </w:p>
@@ -266,55 +281,54 @@
           <w:b/>
           <w:bCs/>
         </w:rPr>
-        <w:t xml:space="preserve">Source. </w:t>
-      </w:r>
-      <w:r>
-        <w:t xml:space="preserve">CSIRO Image2Biomass (Kaggle): 357 labelled quadrat photographs from </w:t>
-      </w:r>
-      <w:proofErr w:type="gramStart"/>
-      <w:r>
-        <w:t>19</w:t>
-      </w:r>
-      <w:proofErr w:type="gramEnd"/>
-      <w:r>
-        <w:t xml:space="preserve"> sites across four Australian states (Tasmania, NSW, WA, Victoria), collected 2014-2017. Each image carries metadata: state, pasture species, pre-grazing NDVI, average sward height, and sampling date.</w:t>
-      </w:r>
-    </w:p>
-    <w:p>
-      <w:pPr>
-        <w:spacing w:after="140"/>
-        <w:ind w:firstLine="360"/>
-        <w:jc w:val="both"/>
-      </w:pPr>
-      <w:r>
-        <w:rPr>
-          <w:b/>
-          <w:bCs/>
-        </w:rPr>
-        <w:t xml:space="preserve">Format. </w:t>
-      </w:r>
-      <w:r>
-        <w:t>The raw CSV is in long format (1785 rows = 357 images x 5 targets). We pivot to wide format (one row per image, five target columns) and extract month from the date.</w:t>
-      </w:r>
-    </w:p>
-    <w:p>
-      <w:pPr>
-        <w:spacing w:after="140"/>
-        <w:ind w:firstLine="360"/>
-        <w:jc w:val="both"/>
-        <w:rPr>
-          <w:lang w:val="ru-RU"/>
-        </w:rPr>
-      </w:pPr>
-      <w:r>
-        <w:rPr>
-          <w:b/>
-          <w:bCs/>
-        </w:rPr>
-        <w:t xml:space="preserve">Target characteristics. </w:t>
-      </w:r>
-      <w:r>
-        <w:t>All five targets are strongly right-skewed (skewness 1.4-2.8, kurtosis 3-9). Clover is the hardest: 37.8% zeros and the highest skew (2.84). We therefore model targets in log1p space and invert predictions with expm1, clipping to non-negative values.</w:t>
+        <w:t>Source.</w:t>
+      </w:r>
+      <w:r>
+        <w:t xml:space="preserve"> CSIRO Image2Biomass (Kaggle): 357 labelled quadrat photographs from 19 sites across four Australian states (Tasmania, NSW, WA, Victoria), collected 2014-2017. Each image carries metadata: state, pasture species, pre-grazing NDVI, average sward height, and sampling date.</w:t>
+      </w:r>
+    </w:p>
+    <w:p>
+      <w:pPr>
+        <w:spacing w:after="140"/>
+        <w:ind w:firstLine="360"/>
+        <w:jc w:val="both"/>
+      </w:pPr>
+      <w:r>
+        <w:rPr>
+          <w:b/>
+          <w:bCs/>
+        </w:rPr>
+        <w:t>Format.</w:t>
+      </w:r>
+      <w:r>
+        <w:t xml:space="preserve"> The raw CSV is in long format (1785 rows = 357 images x 5 targets). We pivot to wide format (one row per image, five target columns) and extract month from the date.</w:t>
+      </w:r>
+    </w:p>
+    <w:p>
+      <w:pPr>
+        <w:spacing w:after="140"/>
+        <w:ind w:firstLine="360"/>
+        <w:jc w:val="both"/>
+      </w:pPr>
+      <w:r>
+        <w:rPr>
+          <w:b/>
+          <w:bCs/>
+        </w:rPr>
+        <w:t>Target characteristics.</w:t>
+      </w:r>
+      <w:r>
+        <w:t xml:space="preserve"> All five targets are strongly right-skewed (skewness 1.4-2.8, kurtosis 3-9). Clover is the hardest: 37.8% zeros and the highest skew (2.84). We therefore model targets in </w:t>
+      </w:r>
+      <w:r>
+        <w:rPr>
+          <w:b/>
+          <w:bCs/>
+        </w:rPr>
+        <w:t>log1p</w:t>
+      </w:r>
+      <w:r>
+        <w:t xml:space="preserve"> space and invert predictions with expm1, clipping to non-negative values.</w:t>
       </w:r>
     </w:p>
     <w:p>
@@ -331,7 +345,7 @@
         </w:rPr>
         <w:lastRenderedPageBreak/>
         <w:drawing>
-          <wp:inline distT="0" distB="0" distL="0" distR="0" wp14:anchorId="46EFCBA1" wp14:editId="368563BE">
+          <wp:inline distT="0" distB="0" distL="0" distR="0" wp14:anchorId="46EFCBA1" wp14:editId="3D5D7B1C">
             <wp:extent cx="5731510" cy="1989455"/>
             <wp:effectExtent l="0" t="0" r="2540" b="0"/>
             <wp:docPr id="53722673" name="Picture 2"/>
@@ -412,39 +426,35 @@
           <w:b/>
           <w:bCs/>
         </w:rPr>
-        <w:t xml:space="preserve">Cleaning and feature engineering. </w:t>
-      </w:r>
-      <w:r>
-        <w:t>No missing values in the metadata. We collapse rare species (&lt;10 images) into an "Other" category to reduce categorical noise. We verified the physical constraint Total = Green + Dead + Clover holds in 99.7% of rows (one rounding violation).</w:t>
-      </w:r>
-    </w:p>
-    <w:p>
-      <w:pPr>
-        <w:spacing w:after="140"/>
-        <w:ind w:firstLine="360"/>
-        <w:jc w:val="both"/>
-        <w:rPr>
-          <w:lang w:val="ru-RU"/>
-        </w:rPr>
-      </w:pPr>
-      <w:r>
-        <w:rPr>
-          <w:b/>
-          <w:bCs/>
-        </w:rPr>
-        <w:t xml:space="preserve">Key correlations (motivation for the project). </w:t>
-      </w:r>
-      <w:r>
-        <w:t xml:space="preserve">Height correlates with green mass (r=0.65) and total (r=0.50); NDVI correlates with GDM (r=0.47) and total (r=0.36). Together these two ground measurements form a strong predictor — but r=0.5 leaves </w:t>
-      </w:r>
-      <w:proofErr w:type="gramStart"/>
-      <w:r>
-        <w:t>most of</w:t>
-      </w:r>
-      <w:proofErr w:type="gramEnd"/>
-      <w:r>
-        <w:t xml:space="preserve"> the variance unexplained, which is the headroom an image could close. NDVI also shows heteroscedasticity (saturation on dense pasture), suggesting imagery might help where NDVI plateaus.</w:t>
-      </w:r>
+        <w:t>Cleaning and feature engineering.</w:t>
+      </w:r>
+      <w:r>
+        <w:t xml:space="preserve"> No missing values in the metadata. We collapse rare species (&lt;10 images) into an "Other" category to reduce categorical noise. We verified the physical constraint Total = Green + Dead + Clover holds in 99.7% of rows (one rounding violation).</w:t>
+      </w:r>
+    </w:p>
+    <w:p>
+      <w:pPr>
+        <w:spacing w:after="140"/>
+        <w:ind w:firstLine="360"/>
+        <w:jc w:val="both"/>
+      </w:pPr>
+      <w:r>
+        <w:rPr>
+          <w:b/>
+          <w:bCs/>
+        </w:rPr>
+        <w:t>Key correlations (motivation for the project).</w:t>
+      </w:r>
+      <w:r>
+        <w:t xml:space="preserve"> Height correlates with green mass (r=0.65) and total (r=0.50); NDVI correlates with GDM (r=0.47) and total (r=0.36). Together these two ground measurements form a strong predictor — but r~0.5 leaves most of the variance unexplained, which is the headroom an image could close. NDVI also shows heteroscedasticity (saturation on dense pasture), suggesting imagery might help where NDVI plateaus.</w:t>
+      </w:r>
+    </w:p>
+    <w:p>
+      <w:pPr>
+        <w:spacing w:after="140"/>
+        <w:ind w:firstLine="360"/>
+        <w:jc w:val="both"/>
+      </w:pPr>
     </w:p>
     <w:p>
       <w:pPr>
@@ -516,7 +526,6 @@
         <w:rPr>
           <w:i/>
           <w:iCs/>
-          <w:lang w:val="ru-RU"/>
         </w:rPr>
       </w:pPr>
       <w:r>
@@ -622,8 +631,14 @@
       <w:pPr>
         <w:pStyle w:val="Heading1"/>
         <w:ind w:firstLine="360"/>
-      </w:pPr>
-      <w:r>
+        <w:rPr>
+          <w:color w:val="215E99" w:themeColor="text2" w:themeTint="BF"/>
+        </w:rPr>
+      </w:pPr>
+      <w:r>
+        <w:rPr>
+          <w:color w:val="215E99" w:themeColor="text2" w:themeTint="BF"/>
+        </w:rPr>
         <w:t>3. Data Organization</w:t>
       </w:r>
     </w:p>
@@ -638,6 +653,10 @@
       </w:r>
       <w:proofErr w:type="spellStart"/>
       <w:r>
+        <w:rPr>
+          <w:b/>
+          <w:bCs/>
+        </w:rPr>
         <w:t>StratifiedGroupKFold</w:t>
       </w:r>
       <w:proofErr w:type="spellEnd"/>
@@ -658,314 +677,328 @@
       </w:r>
       <w:proofErr w:type="spellEnd"/>
       <w:r>
-        <w:t xml:space="preserve"> (the biomass range </w:t>
+        <w:t xml:space="preserve"> (the biomass range is balanced across folds).</w:t>
+      </w:r>
+    </w:p>
+    <w:p>
+      <w:pPr>
+        <w:spacing w:after="140"/>
+        <w:ind w:firstLine="360"/>
+        <w:jc w:val="both"/>
+      </w:pPr>
+      <w:r>
+        <w:t xml:space="preserve">We chose 5-fold cross-validation over a single train/test split for a more reliable estimate. </w:t>
+      </w:r>
+      <w:proofErr w:type="spellStart"/>
+      <w:r>
+        <w:t>GroupKFold</w:t>
+      </w:r>
+      <w:proofErr w:type="spellEnd"/>
+      <w:r>
+        <w:t xml:space="preserve"> by state was rejected because states are imbalanced (Tas 138 ... WA 32); the smallest state would yield an unstable fold. State is instead used for error analysis. The </w:t>
+      </w:r>
+      <w:r>
+        <w:rPr>
+          <w:b/>
+          <w:bCs/>
+        </w:rPr>
+        <w:t>same folds</w:t>
+      </w:r>
+      <w:r>
+        <w:t xml:space="preserve"> are used for every model (tabular and image</w:t>
       </w:r>
       <w:proofErr w:type="gramStart"/>
       <w:r>
-        <w:t>is balanced</w:t>
+        <w:t>)</w:t>
       </w:r>
       <w:proofErr w:type="gramEnd"/>
       <w:r>
-        <w:t xml:space="preserve"> across folds).</w:t>
-      </w:r>
-    </w:p>
-    <w:p>
-      <w:pPr>
-        <w:spacing w:after="140"/>
-        <w:ind w:firstLine="360"/>
-        <w:jc w:val="both"/>
-      </w:pPr>
-      <w:r>
-        <w:t xml:space="preserve">We chose 5-fold cross-validation over a single train/test split for a more reliable estimate. </w:t>
+        <w:t xml:space="preserve"> so comparisons are fair.</w:t>
+      </w:r>
+    </w:p>
+    <w:p>
+      <w:pPr>
+        <w:spacing w:after="140"/>
+        <w:ind w:firstLine="360"/>
+        <w:jc w:val="both"/>
+      </w:pPr>
+      <w:r>
+        <w:t>Note on the Kaggle hidden test: it omits metadata, so a fair modality study must be done on the locally labelled data via cross-validation, not the leaderboard.</w:t>
+      </w:r>
+    </w:p>
+    <w:p>
+      <w:pPr>
+        <w:pStyle w:val="Heading1"/>
+        <w:ind w:firstLine="360"/>
+        <w:rPr>
+          <w:color w:val="215E99" w:themeColor="text2" w:themeTint="BF"/>
+        </w:rPr>
+      </w:pPr>
+      <w:r>
+        <w:rPr>
+          <w:color w:val="215E99" w:themeColor="text2" w:themeTint="BF"/>
+        </w:rPr>
+        <w:t>4. Methods</w:t>
+      </w:r>
+    </w:p>
+    <w:p>
+      <w:pPr>
+        <w:spacing w:after="140"/>
+        <w:ind w:firstLine="360"/>
+        <w:jc w:val="both"/>
+      </w:pPr>
+      <w:r>
+        <w:t>We build a comparison aligned with the course syllabus:</w:t>
+      </w:r>
+    </w:p>
+    <w:p>
+      <w:pPr>
+        <w:spacing w:after="140"/>
+        <w:ind w:firstLine="360"/>
+        <w:jc w:val="both"/>
+      </w:pPr>
+      <w:r>
+        <w:rPr>
+          <w:b/>
+          <w:bCs/>
+        </w:rPr>
+        <w:t>Tier 0 — Naive baseline.</w:t>
+      </w:r>
+      <w:r>
+        <w:t xml:space="preserve"> Predict the training-fold median per target. </w:t>
+      </w:r>
+      <w:proofErr w:type="gramStart"/>
+      <w:r>
+        <w:t>The</w:t>
+      </w:r>
+      <w:proofErr w:type="gramEnd"/>
+      <w:r>
+        <w:t xml:space="preserve"> reference </w:t>
+      </w:r>
+      <w:proofErr w:type="gramStart"/>
+      <w:r>
+        <w:t>floor</w:t>
+      </w:r>
+      <w:proofErr w:type="gramEnd"/>
+      <w:r>
+        <w:t xml:space="preserve"> </w:t>
+      </w:r>
+      <w:proofErr w:type="gramStart"/>
+      <w:r>
+        <w:t>any</w:t>
+      </w:r>
+      <w:proofErr w:type="gramEnd"/>
+      <w:r>
+        <w:t xml:space="preserve"> useful model must beat.</w:t>
+      </w:r>
+    </w:p>
+    <w:p>
+      <w:pPr>
+        <w:spacing w:after="140"/>
+        <w:ind w:firstLine="360"/>
+        <w:jc w:val="both"/>
+      </w:pPr>
+      <w:r>
+        <w:rPr>
+          <w:b/>
+          <w:bCs/>
+        </w:rPr>
+        <w:t>Tier 1 — Tabular models (sessions 4, 7).</w:t>
+      </w:r>
+      <w:r>
+        <w:t xml:space="preserve"> </w:t>
       </w:r>
       <w:proofErr w:type="spellStart"/>
       <w:r>
-        <w:t>GroupKFold</w:t>
+        <w:t>RandomForest</w:t>
       </w:r>
       <w:proofErr w:type="spellEnd"/>
       <w:r>
-        <w:t xml:space="preserve"> by state </w:t>
+        <w:t xml:space="preserve"> and </w:t>
+      </w:r>
+      <w:proofErr w:type="spellStart"/>
+      <w:r>
+        <w:t>HistGradientBoosting</w:t>
+      </w:r>
+      <w:proofErr w:type="spellEnd"/>
+      <w:r>
+        <w:t xml:space="preserve"> on metadata features (NDVI, height, month, species, state), one model per target in log1p space. One-hot encoding for </w:t>
+      </w:r>
+      <w:proofErr w:type="spellStart"/>
+      <w:r>
+        <w:t>categoricals</w:t>
+      </w:r>
+      <w:proofErr w:type="spellEnd"/>
+      <w:r>
+        <w:t>.</w:t>
+      </w:r>
+    </w:p>
+    <w:p>
+      <w:pPr>
+        <w:spacing w:after="140"/>
+        <w:ind w:firstLine="360"/>
+        <w:jc w:val="both"/>
+      </w:pPr>
+      <w:r>
+        <w:rPr>
+          <w:b/>
+          <w:bCs/>
+        </w:rPr>
+        <w:t>Tier 2 — CNN from scratch (session 10).</w:t>
+      </w:r>
+      <w:r>
+        <w:t xml:space="preserve"> A small 4-block convnet (conv-BN-</w:t>
+      </w:r>
+      <w:proofErr w:type="spellStart"/>
+      <w:r>
+        <w:t>ReLU</w:t>
+      </w:r>
+      <w:proofErr w:type="spellEnd"/>
+      <w:r>
+        <w:t>-pool) with a regression head, trained on 224x224 RGB. Kept small because ~285 training images would overfit a large network.</w:t>
+      </w:r>
+    </w:p>
+    <w:p>
+      <w:pPr>
+        <w:spacing w:after="140"/>
+        <w:ind w:firstLine="360"/>
+        <w:jc w:val="both"/>
+      </w:pPr>
+      <w:r>
+        <w:rPr>
+          <w:b/>
+          <w:bCs/>
+        </w:rPr>
+        <w:t xml:space="preserve">Tier 3 — Transfer </w:t>
       </w:r>
       <w:proofErr w:type="gramStart"/>
       <w:r>
-        <w:t>was rejected</w:t>
+        <w:rPr>
+          <w:b/>
+          <w:bCs/>
+        </w:rPr>
+        <w:t>learning</w:t>
       </w:r>
       <w:proofErr w:type="gramEnd"/>
       <w:r>
-        <w:t xml:space="preserve"> because states are imbalanced (Tas 138 ... WA 32); the smallest state would yield an unstable fold. State </w:t>
+        <w:rPr>
+          <w:b/>
+          <w:bCs/>
+        </w:rPr>
+        <w:t xml:space="preserve"> (session 12).</w:t>
+      </w:r>
+      <w:r>
+        <w:t xml:space="preserve"> A pretrained ResNet18 with a 5-output regression head, in two regimes: </w:t>
+      </w:r>
+      <w:r>
+        <w:rPr>
+          <w:b/>
+          <w:bCs/>
+        </w:rPr>
+        <w:t>frozen</w:t>
+      </w:r>
+      <w:r>
+        <w:t xml:space="preserve"> (feature extraction, head only) and </w:t>
+      </w:r>
+      <w:r>
+        <w:rPr>
+          <w:b/>
+          <w:bCs/>
+        </w:rPr>
+        <w:t>fine-tuned</w:t>
+      </w:r>
+      <w:r>
+        <w:t xml:space="preserve"> (whole backbone). ImageNet normalization; mild augmentation (flips, light jitter) chosen so as not to destroy the texture/density signal.</w:t>
+      </w:r>
+    </w:p>
+    <w:p>
+      <w:pPr>
+        <w:spacing w:after="140"/>
+        <w:ind w:firstLine="360"/>
+        <w:jc w:val="both"/>
+      </w:pPr>
+      <w:r>
+        <w:rPr>
+          <w:b/>
+          <w:bCs/>
+        </w:rPr>
+        <w:t>Tier 4 — Self-supervised features (DINOv2).</w:t>
+      </w:r>
+      <w:r>
+        <w:t xml:space="preserve"> A frozen DINOv2 </w:t>
+      </w:r>
+      <w:proofErr w:type="spellStart"/>
+      <w:r>
+        <w:t>ViT</w:t>
+      </w:r>
+      <w:proofErr w:type="spellEnd"/>
+      <w:r>
+        <w:t xml:space="preserve">-S/14 (self-supervised, 384-dim embeddings) with the same regression head. Embeddings are precomputed once and </w:t>
       </w:r>
       <w:proofErr w:type="gramStart"/>
       <w:r>
-        <w:t>is instead used</w:t>
+        <w:t>cached</w:t>
       </w:r>
       <w:proofErr w:type="gramEnd"/>
       <w:r>
-        <w:t xml:space="preserve"> for error analysis. The same folds </w:t>
-      </w:r>
-      <w:proofErr w:type="gramStart"/>
-      <w:r>
-        <w:t>are used</w:t>
-      </w:r>
-      <w:proofErr w:type="gramEnd"/>
-      <w:r>
-        <w:t xml:space="preserve"> for every model (tabular and image</w:t>
-      </w:r>
-      <w:proofErr w:type="gramStart"/>
-      <w:r>
-        <w:t>)</w:t>
-      </w:r>
-      <w:proofErr w:type="gramEnd"/>
-      <w:r>
-        <w:t xml:space="preserve"> so comparisons are fair.</w:t>
-      </w:r>
-    </w:p>
-    <w:p>
-      <w:pPr>
-        <w:spacing w:after="140"/>
-        <w:ind w:firstLine="360"/>
-        <w:jc w:val="both"/>
-      </w:pPr>
-      <w:r>
-        <w:t xml:space="preserve">Note on the Kaggle hidden test: it omits metadata, so a fair modality study must </w:t>
-      </w:r>
-      <w:proofErr w:type="gramStart"/>
-      <w:r>
-        <w:t>be done</w:t>
-      </w:r>
-      <w:proofErr w:type="gramEnd"/>
-      <w:r>
-        <w:t xml:space="preserve"> on the locally labelled data via cross-validation, not the leaderboard.</w:t>
+        <w:t>, so only the head is trained per fold. This is compared directly against frozen ResNet18 to isolate the effect of pretraining type (self-supervised vs ImageNet) at the same frozen regime.</w:t>
+      </w:r>
+    </w:p>
+    <w:p>
+      <w:pPr>
+        <w:spacing w:after="140"/>
+        <w:ind w:firstLine="360"/>
+        <w:jc w:val="both"/>
+      </w:pPr>
+      <w:r>
+        <w:rPr>
+          <w:b/>
+          <w:bCs/>
+        </w:rPr>
+        <w:lastRenderedPageBreak/>
+        <w:t>Training.</w:t>
+      </w:r>
+      <w:r>
+        <w:t xml:space="preserve"> Adam optimizer, MSE loss in log1p space, early stopping on validation weighted-RMSE (original scale). Fine-tuning uses a smaller learning rate (1e-4) since the whole backbone is updated. All image models share the dataset pipeline and CV folds.</w:t>
+      </w:r>
+    </w:p>
+    <w:p>
+      <w:pPr>
+        <w:spacing w:after="140"/>
+        <w:ind w:firstLine="360"/>
+        <w:jc w:val="both"/>
+      </w:pPr>
+      <w:r>
+        <w:rPr>
+          <w:b/>
+          <w:bCs/>
+        </w:rPr>
+        <w:t>Deployment (session 11).</w:t>
+      </w:r>
+      <w:r>
+        <w:t xml:space="preserve"> A </w:t>
+      </w:r>
+      <w:proofErr w:type="spellStart"/>
+      <w:r>
+        <w:t>Gradio</w:t>
+      </w:r>
+      <w:proofErr w:type="spellEnd"/>
+      <w:r>
+        <w:t xml:space="preserve"> app serving the image-only model, deployed to Hugging Face Spaces (see Section 7).</w:t>
       </w:r>
     </w:p>
     <w:p>
       <w:pPr>
         <w:pStyle w:val="Heading1"/>
         <w:ind w:firstLine="360"/>
-      </w:pPr>
-      <w:r>
-        <w:t>4. Methods</w:t>
-      </w:r>
-    </w:p>
-    <w:p>
-      <w:pPr>
-        <w:spacing w:after="140"/>
-        <w:ind w:firstLine="360"/>
-        <w:jc w:val="both"/>
-      </w:pPr>
-      <w:r>
-        <w:t xml:space="preserve">We </w:t>
-      </w:r>
-      <w:proofErr w:type="gramStart"/>
-      <w:r>
-        <w:t>build</w:t>
-      </w:r>
-      <w:proofErr w:type="gramEnd"/>
-      <w:r>
-        <w:t xml:space="preserve"> a four-tier comparison aligned with the course syllabus:</w:t>
-      </w:r>
-    </w:p>
-    <w:p>
-      <w:pPr>
-        <w:spacing w:after="140"/>
-        <w:ind w:firstLine="360"/>
-        <w:jc w:val="both"/>
-      </w:pPr>
-      <w:r>
-        <w:rPr>
-          <w:b/>
-          <w:bCs/>
-        </w:rPr>
-        <w:t xml:space="preserve">Tier 0 — Naive baseline. </w:t>
-      </w:r>
-      <w:r>
-        <w:t xml:space="preserve">Predict the training-fold median per target. </w:t>
-      </w:r>
-      <w:proofErr w:type="gramStart"/>
-      <w:r>
-        <w:t>The</w:t>
-      </w:r>
-      <w:proofErr w:type="gramEnd"/>
-      <w:r>
-        <w:t xml:space="preserve"> reference </w:t>
-      </w:r>
-      <w:proofErr w:type="gramStart"/>
-      <w:r>
-        <w:t>floor</w:t>
-      </w:r>
-      <w:proofErr w:type="gramEnd"/>
-      <w:r>
-        <w:t xml:space="preserve"> </w:t>
-      </w:r>
-      <w:proofErr w:type="gramStart"/>
-      <w:r>
-        <w:t>any</w:t>
-      </w:r>
-      <w:proofErr w:type="gramEnd"/>
-      <w:r>
-        <w:t xml:space="preserve"> useful model must beat.</w:t>
-      </w:r>
-    </w:p>
-    <w:p>
-      <w:pPr>
-        <w:spacing w:after="140"/>
-        <w:ind w:firstLine="360"/>
-        <w:jc w:val="both"/>
-      </w:pPr>
-      <w:r>
-        <w:rPr>
-          <w:b/>
-          <w:bCs/>
-        </w:rPr>
-        <w:t xml:space="preserve">Tier 1 — Tabular models (sessions 4, 7). </w:t>
-      </w:r>
-      <w:proofErr w:type="spellStart"/>
-      <w:r>
-        <w:t>RandomForest</w:t>
-      </w:r>
-      <w:proofErr w:type="spellEnd"/>
-      <w:r>
-        <w:t xml:space="preserve"> and </w:t>
-      </w:r>
-      <w:proofErr w:type="spellStart"/>
-      <w:r>
-        <w:t>HistGradientBoosting</w:t>
-      </w:r>
-      <w:proofErr w:type="spellEnd"/>
-      <w:r>
-        <w:t xml:space="preserve"> on metadata features (NDVI, height, month, species, state), one model per target in log1p space. One-hot encoding for </w:t>
-      </w:r>
-      <w:proofErr w:type="spellStart"/>
-      <w:r>
-        <w:t>categoricals</w:t>
-      </w:r>
-      <w:proofErr w:type="spellEnd"/>
-      <w:r>
-        <w:t>.</w:t>
-      </w:r>
-    </w:p>
-    <w:p>
-      <w:pPr>
-        <w:spacing w:after="140"/>
-        <w:ind w:firstLine="360"/>
-        <w:jc w:val="both"/>
-      </w:pPr>
-      <w:r>
-        <w:rPr>
-          <w:b/>
-          <w:bCs/>
-        </w:rPr>
-        <w:t xml:space="preserve">Tier 2 — CNN from scratch (session 10). </w:t>
-      </w:r>
-      <w:r>
-        <w:t>A small 4-block convnet (conv-BN-</w:t>
-      </w:r>
-      <w:proofErr w:type="spellStart"/>
-      <w:r>
-        <w:t>ReLU</w:t>
-      </w:r>
-      <w:proofErr w:type="spellEnd"/>
-      <w:r>
-        <w:t>-pool) with a regression head, trained on 224x224 RGB. Kept small because ~285 training images would overfit a large network.</w:t>
-      </w:r>
-    </w:p>
-    <w:p>
-      <w:pPr>
-        <w:spacing w:after="140"/>
-        <w:ind w:firstLine="360"/>
-        <w:jc w:val="both"/>
-      </w:pPr>
-      <w:r>
-        <w:rPr>
-          <w:b/>
-          <w:bCs/>
-        </w:rPr>
-        <w:t xml:space="preserve">Tier 3 — Transfer </w:t>
-      </w:r>
-      <w:proofErr w:type="gramStart"/>
-      <w:r>
-        <w:rPr>
-          <w:b/>
-          <w:bCs/>
-        </w:rPr>
-        <w:t>learning</w:t>
-      </w:r>
-      <w:proofErr w:type="gramEnd"/>
-      <w:r>
-        <w:rPr>
-          <w:b/>
-          <w:bCs/>
-        </w:rPr>
-        <w:t xml:space="preserve"> (session 12). </w:t>
-      </w:r>
-      <w:r>
-        <w:t>A pretrained ResNet18 with a 5-output regression head, in two regimes: frozen (feature extraction, head only) and fine-tuned (whole backbone). ImageNet normalization; mild augmentation (flips, light jitter) chosen so as not to destroy the texture/density signal.</w:t>
-      </w:r>
-    </w:p>
-    <w:p>
-      <w:pPr>
-        <w:spacing w:after="140"/>
-        <w:ind w:firstLine="360"/>
-        <w:jc w:val="both"/>
-      </w:pPr>
-      <w:r>
-        <w:rPr>
-          <w:b/>
-          <w:bCs/>
-        </w:rPr>
-        <w:t xml:space="preserve">Training. </w:t>
-      </w:r>
-      <w:r>
-        <w:t xml:space="preserve">Adam optimizer, MSE loss in log1p space, early stopping on validation weighted-RMSE (original scale). Fine-tuning uses a smaller learning rate (1e-4) since the whole backbone </w:t>
-      </w:r>
-      <w:proofErr w:type="gramStart"/>
-      <w:r>
-        <w:t>is updated</w:t>
-      </w:r>
-      <w:proofErr w:type="gramEnd"/>
-      <w:r>
-        <w:t xml:space="preserve">. All image models share the dataset pipeline and </w:t>
-      </w:r>
-      <w:proofErr w:type="gramStart"/>
-      <w:r>
-        <w:t>CV</w:t>
-      </w:r>
-      <w:proofErr w:type="gramEnd"/>
-      <w:r>
-        <w:t xml:space="preserve"> folds.</w:t>
-      </w:r>
-    </w:p>
-    <w:p>
-      <w:pPr>
-        <w:spacing w:after="140"/>
-        <w:ind w:firstLine="360"/>
-        <w:jc w:val="both"/>
-      </w:pPr>
-      <w:r>
-        <w:rPr>
-          <w:b/>
-          <w:bCs/>
-        </w:rPr>
-        <w:t xml:space="preserve">Deployment (session 11). </w:t>
-      </w:r>
-      <w:r>
-        <w:t xml:space="preserve">A </w:t>
-      </w:r>
-      <w:proofErr w:type="spellStart"/>
-      <w:r>
-        <w:t>Gradio</w:t>
-      </w:r>
-      <w:proofErr w:type="spellEnd"/>
-      <w:r>
-        <w:t xml:space="preserve"> app serving the image-only model, deployed to Hugging Face Spaces (see Section 7).</w:t>
-      </w:r>
-    </w:p>
-    <w:p>
-      <w:pPr>
-        <w:pStyle w:val="Heading1"/>
-        <w:ind w:firstLine="360"/>
-      </w:pPr>
-      <w:r>
-        <w:lastRenderedPageBreak/>
+        <w:rPr>
+          <w:color w:val="215E99" w:themeColor="text2" w:themeTint="BF"/>
+        </w:rPr>
+      </w:pPr>
+      <w:r>
+        <w:rPr>
+          <w:color w:val="215E99" w:themeColor="text2" w:themeTint="BF"/>
+        </w:rPr>
         <w:t>5. Results</w:t>
       </w:r>
     </w:p>
@@ -980,80 +1013,77 @@
           <w:b/>
           <w:bCs/>
         </w:rPr>
-        <w:t xml:space="preserve">Evaluation metric. </w:t>
-      </w:r>
-      <w:r>
-        <w:t>Competition-style weighted RMSE (target weights 0.1/0.1/0.1/0.2/0.5, with Total weighted highest) plus per-target RMSE, MAE, and R2 on the original gram scale, aggregated over 5 folds (mean +/- std).</w:t>
-      </w:r>
-    </w:p>
-    <w:p>
-      <w:pPr>
-        <w:spacing w:after="140"/>
-        <w:ind w:firstLine="360"/>
-        <w:jc w:val="both"/>
-        <w:rPr>
-          <w:lang w:val="ru-RU"/>
-        </w:rPr>
-      </w:pPr>
-      <w:r>
-        <w:t xml:space="preserve">The main comparison </w:t>
-      </w:r>
-      <w:proofErr w:type="gramStart"/>
-      <w:r>
-        <w:t>is shown</w:t>
-      </w:r>
-      <w:proofErr w:type="gramEnd"/>
-      <w:r>
-        <w:t xml:space="preserve"> in Table 1. All weighted-RMSE values are means over 5 folds: fine-tune 18.23 +/- 2.83, </w:t>
-      </w:r>
-      <w:proofErr w:type="spellStart"/>
-      <w:r>
-        <w:t>simple_cnn</w:t>
-      </w:r>
-      <w:proofErr w:type="spellEnd"/>
-      <w:r>
-        <w:t xml:space="preserve"> 18.70 +/- 2.64, frozen 24.74 +/- 2.22. A final deployable model trained on an enlarged train split reached 15.94 on a single holdout; the table reports the more conservative cross-validated figure.</w:t>
+        <w:t>Evaluation metric.</w:t>
+      </w:r>
+      <w:r>
+        <w:t xml:space="preserve"> Competition-style weighted RMSE (target weights 0.1/0.1/0.1/0.2/0.5, with Total weighted highest) plus per-target RMSE, MAE, and R2 on the original gram scale, aggregated over 5 folds (mean +/- std).</w:t>
+      </w:r>
+    </w:p>
+    <w:p>
+      <w:pPr>
+        <w:spacing w:after="140"/>
+        <w:ind w:firstLine="360"/>
+        <w:jc w:val="both"/>
+      </w:pPr>
+      <w:r>
+        <w:rPr>
+          <w:b/>
+          <w:bCs/>
+        </w:rPr>
+        <w:t>Main comparison table</w:t>
+      </w:r>
+      <w:r>
+        <w:t xml:space="preserve"> (weighted RMSE, lower is better):</w:t>
       </w:r>
     </w:p>
     <w:tbl>
       <w:tblPr>
-        <w:tblStyle w:val="PlainTable3"/>
-        <w:tblW w:w="0" w:type="auto"/>
-        <w:jc w:val="center"/>
-        <w:tblLook w:val="04A0" w:firstRow="1" w:lastRow="0" w:firstColumn="1" w:lastColumn="0" w:noHBand="0" w:noVBand="1"/>
+        <w:tblStyle w:val="ListTable3-Accent4"/>
+        <w:tblW w:w="9025" w:type="dxa"/>
+        <w:tblLook w:val="0020" w:firstRow="1" w:lastRow="0" w:firstColumn="0" w:lastColumn="0" w:noHBand="0" w:noVBand="0"/>
       </w:tblPr>
       <w:tblGrid>
-        <w:gridCol w:w="773"/>
-        <w:gridCol w:w="3571"/>
-        <w:gridCol w:w="2789"/>
+        <w:gridCol w:w="3094"/>
+        <w:gridCol w:w="3581"/>
+        <w:gridCol w:w="1309"/>
+        <w:gridCol w:w="1041"/>
       </w:tblGrid>
       <w:tr>
         <w:trPr>
           <w:cnfStyle w:val="100000000000" w:firstRow="1" w:lastRow="0" w:firstColumn="0" w:lastColumn="0" w:oddVBand="0" w:evenVBand="0" w:oddHBand="0" w:evenHBand="0" w:firstRowFirstColumn="0" w:firstRowLastColumn="0" w:lastRowFirstColumn="0" w:lastRowLastColumn="0"/>
-          <w:trHeight w:val="342"/>
-          <w:jc w:val="center"/>
+          <w:trHeight w:val="375"/>
         </w:trPr>
         <w:tc>
           <w:tcPr>
-            <w:cnfStyle w:val="001000000100" w:firstRow="0" w:lastRow="0" w:firstColumn="1" w:lastColumn="0" w:oddVBand="0" w:evenVBand="0" w:oddHBand="0" w:evenHBand="0" w:firstRowFirstColumn="1" w:firstRowLastColumn="0" w:lastRowFirstColumn="0" w:lastRowLastColumn="0"/>
-            <w:tcW w:w="773" w:type="dxa"/>
+            <w:cnfStyle w:val="000010000000" w:firstRow="0" w:lastRow="0" w:firstColumn="0" w:lastColumn="0" w:oddVBand="1" w:evenVBand="0" w:oddHBand="0" w:evenHBand="0" w:firstRowFirstColumn="0" w:firstRowLastColumn="0" w:lastRowFirstColumn="0" w:lastRowLastColumn="0"/>
+            <w:tcW w:w="0" w:type="auto"/>
           </w:tcPr>
           <w:p>
             <w:pPr>
-              <w:jc w:val="both"/>
+              <w:spacing w:after="140"/>
+              <w:jc w:val="center"/>
               <w:rPr>
-                <w:lang w:val="ru-RU"/>
+                <w:b w:val="0"/>
+                <w:bCs w:val="0"/>
               </w:rPr>
             </w:pPr>
+            <w:r>
+              <w:rPr>
+                <w:b w:val="0"/>
+                <w:bCs w:val="0"/>
+              </w:rPr>
+              <w:t>Model</w:t>
+            </w:r>
           </w:p>
         </w:tc>
         <w:tc>
           <w:tcPr>
-            <w:tcW w:w="3571" w:type="dxa"/>
+            <w:tcW w:w="0" w:type="auto"/>
           </w:tcPr>
           <w:p>
             <w:pPr>
-              <w:jc w:val="both"/>
+              <w:spacing w:after="140"/>
+              <w:jc w:val="center"/>
               <w:cnfStyle w:val="100000000000" w:firstRow="1" w:lastRow="0" w:firstColumn="0" w:lastColumn="0" w:oddVBand="0" w:evenVBand="0" w:oddHBand="0" w:evenHBand="0" w:firstRowFirstColumn="0" w:firstRowLastColumn="0" w:lastRowFirstColumn="0" w:lastRowLastColumn="0"/>
               <w:rPr>
                 <w:b w:val="0"/>
@@ -1065,17 +1095,41 @@
                 <w:b w:val="0"/>
                 <w:bCs w:val="0"/>
               </w:rPr>
-              <w:t>model</w:t>
+              <w:t>Weighted RMSE (mean +/- std)</w:t>
             </w:r>
           </w:p>
         </w:tc>
         <w:tc>
           <w:tcPr>
-            <w:tcW w:w="2789" w:type="dxa"/>
+            <w:cnfStyle w:val="000010000000" w:firstRow="0" w:lastRow="0" w:firstColumn="0" w:lastColumn="0" w:oddVBand="1" w:evenVBand="0" w:oddHBand="0" w:evenHBand="0" w:firstRowFirstColumn="0" w:firstRowLastColumn="0" w:lastRowFirstColumn="0" w:lastRowLastColumn="0"/>
+            <w:tcW w:w="0" w:type="auto"/>
           </w:tcPr>
           <w:p>
             <w:pPr>
-              <w:jc w:val="both"/>
+              <w:spacing w:after="140"/>
+              <w:jc w:val="center"/>
+              <w:rPr>
+                <w:b w:val="0"/>
+                <w:bCs w:val="0"/>
+              </w:rPr>
+            </w:pPr>
+            <w:r>
+              <w:rPr>
+                <w:b w:val="0"/>
+                <w:bCs w:val="0"/>
+              </w:rPr>
+              <w:t>R2 (Total)</w:t>
+            </w:r>
+          </w:p>
+        </w:tc>
+        <w:tc>
+          <w:tcPr>
+            <w:tcW w:w="0" w:type="auto"/>
+          </w:tcPr>
+          <w:p>
+            <w:pPr>
+              <w:spacing w:after="140"/>
+              <w:jc w:val="center"/>
               <w:cnfStyle w:val="100000000000" w:firstRow="1" w:lastRow="0" w:firstColumn="0" w:lastColumn="0" w:oddVBand="0" w:evenVBand="0" w:oddHBand="0" w:evenHBand="0" w:firstRowFirstColumn="0" w:firstRowLastColumn="0" w:lastRowFirstColumn="0" w:lastRowLastColumn="0"/>
               <w:rPr>
                 <w:b w:val="0"/>
@@ -1087,7 +1141,7 @@
                 <w:b w:val="0"/>
                 <w:bCs w:val="0"/>
               </w:rPr>
-              <w:t>weighted_rmse</w:t>
+              <w:t>Type</w:t>
             </w:r>
           </w:p>
         </w:tc>
@@ -1095,31 +1149,17 @@
       <w:tr>
         <w:trPr>
           <w:cnfStyle w:val="000000100000" w:firstRow="0" w:lastRow="0" w:firstColumn="0" w:lastColumn="0" w:oddVBand="0" w:evenVBand="0" w:oddHBand="1" w:evenHBand="0" w:firstRowFirstColumn="0" w:firstRowLastColumn="0" w:lastRowFirstColumn="0" w:lastRowLastColumn="0"/>
-          <w:trHeight w:val="342"/>
-          <w:jc w:val="center"/>
+          <w:trHeight w:val="375"/>
         </w:trPr>
         <w:tc>
           <w:tcPr>
-            <w:cnfStyle w:val="001000000000" w:firstRow="0" w:lastRow="0" w:firstColumn="1" w:lastColumn="0" w:oddVBand="0" w:evenVBand="0" w:oddHBand="0" w:evenHBand="0" w:firstRowFirstColumn="0" w:firstRowLastColumn="0" w:lastRowFirstColumn="0" w:lastRowLastColumn="0"/>
-            <w:tcW w:w="773" w:type="dxa"/>
+            <w:cnfStyle w:val="000010000000" w:firstRow="0" w:lastRow="0" w:firstColumn="0" w:lastColumn="0" w:oddVBand="1" w:evenVBand="0" w:oddHBand="0" w:evenHBand="0" w:firstRowFirstColumn="0" w:firstRowLastColumn="0" w:lastRowFirstColumn="0" w:lastRowLastColumn="0"/>
+            <w:tcW w:w="0" w:type="auto"/>
           </w:tcPr>
           <w:p>
             <w:pPr>
+              <w:spacing w:after="140"/>
               <w:jc w:val="both"/>
-            </w:pPr>
-            <w:r>
-              <w:t>1</w:t>
-            </w:r>
-          </w:p>
-        </w:tc>
-        <w:tc>
-          <w:tcPr>
-            <w:tcW w:w="3571" w:type="dxa"/>
-          </w:tcPr>
-          <w:p>
-            <w:pPr>
-              <w:jc w:val="both"/>
-              <w:cnfStyle w:val="000000100000" w:firstRow="0" w:lastRow="0" w:firstColumn="0" w:lastColumn="0" w:oddVBand="0" w:evenVBand="0" w:oddHBand="1" w:evenHBand="0" w:firstRowFirstColumn="0" w:firstRowLastColumn="0" w:lastRowFirstColumn="0" w:lastRowLastColumn="0"/>
             </w:pPr>
             <w:proofErr w:type="spellStart"/>
             <w:r>
@@ -1127,69 +1167,117 @@
             </w:r>
             <w:proofErr w:type="spellEnd"/>
             <w:r>
-              <w:t xml:space="preserve"> (tabular)</w:t>
+              <w:t xml:space="preserve"> (metadata)</w:t>
             </w:r>
           </w:p>
         </w:tc>
         <w:tc>
           <w:tcPr>
-            <w:tcW w:w="2789" w:type="dxa"/>
+            <w:tcW w:w="0" w:type="auto"/>
           </w:tcPr>
           <w:p>
             <w:pPr>
+              <w:spacing w:after="140"/>
               <w:jc w:val="both"/>
               <w:cnfStyle w:val="000000100000" w:firstRow="0" w:lastRow="0" w:firstColumn="0" w:lastColumn="0" w:oddVBand="0" w:evenVBand="0" w:oddHBand="1" w:evenHBand="0" w:firstRowFirstColumn="0" w:firstRowLastColumn="0" w:lastRowFirstColumn="0" w:lastRowLastColumn="0"/>
             </w:pPr>
             <w:r>
-              <w:t>11.828</w:t>
+              <w:t>11.83 +/- 1.73</w:t>
+            </w:r>
+          </w:p>
+        </w:tc>
+        <w:tc>
+          <w:tcPr>
+            <w:cnfStyle w:val="000010000000" w:firstRow="0" w:lastRow="0" w:firstColumn="0" w:lastColumn="0" w:oddVBand="1" w:evenVBand="0" w:oddHBand="0" w:evenHBand="0" w:firstRowFirstColumn="0" w:firstRowLastColumn="0" w:lastRowFirstColumn="0" w:lastRowLastColumn="0"/>
+            <w:tcW w:w="0" w:type="auto"/>
+          </w:tcPr>
+          <w:p>
+            <w:pPr>
+              <w:spacing w:after="140"/>
+              <w:jc w:val="both"/>
+            </w:pPr>
+            <w:r>
+              <w:t>0.72</w:t>
+            </w:r>
+          </w:p>
+        </w:tc>
+        <w:tc>
+          <w:tcPr>
+            <w:tcW w:w="0" w:type="auto"/>
+          </w:tcPr>
+          <w:p>
+            <w:pPr>
+              <w:spacing w:after="140"/>
+              <w:jc w:val="both"/>
+              <w:cnfStyle w:val="000000100000" w:firstRow="0" w:lastRow="0" w:firstColumn="0" w:lastColumn="0" w:oddVBand="0" w:evenVBand="0" w:oddHBand="1" w:evenHBand="0" w:firstRowFirstColumn="0" w:firstRowLastColumn="0" w:lastRowFirstColumn="0" w:lastRowLastColumn="0"/>
+            </w:pPr>
+            <w:r>
+              <w:t>tabular</w:t>
             </w:r>
           </w:p>
         </w:tc>
       </w:tr>
       <w:tr>
         <w:trPr>
-          <w:trHeight w:val="342"/>
-          <w:jc w:val="center"/>
+          <w:trHeight w:val="375"/>
         </w:trPr>
         <w:tc>
           <w:tcPr>
-            <w:cnfStyle w:val="001000000000" w:firstRow="0" w:lastRow="0" w:firstColumn="1" w:lastColumn="0" w:oddVBand="0" w:evenVBand="0" w:oddHBand="0" w:evenHBand="0" w:firstRowFirstColumn="0" w:firstRowLastColumn="0" w:lastRowFirstColumn="0" w:lastRowLastColumn="0"/>
-            <w:tcW w:w="773" w:type="dxa"/>
+            <w:cnfStyle w:val="000010000000" w:firstRow="0" w:lastRow="0" w:firstColumn="0" w:lastColumn="0" w:oddVBand="1" w:evenVBand="0" w:oddHBand="0" w:evenHBand="0" w:firstRowFirstColumn="0" w:firstRowLastColumn="0" w:lastRowFirstColumn="0" w:lastRowLastColumn="0"/>
+            <w:tcW w:w="0" w:type="auto"/>
           </w:tcPr>
           <w:p>
             <w:pPr>
+              <w:spacing w:after="140"/>
               <w:jc w:val="both"/>
             </w:pPr>
             <w:r>
-              <w:t>2</w:t>
+              <w:t>DINOv2 frozen</w:t>
             </w:r>
           </w:p>
         </w:tc>
         <w:tc>
           <w:tcPr>
-            <w:tcW w:w="3571" w:type="dxa"/>
+            <w:tcW w:w="0" w:type="auto"/>
           </w:tcPr>
           <w:p>
             <w:pPr>
+              <w:spacing w:after="140"/>
               <w:jc w:val="both"/>
               <w:cnfStyle w:val="000000000000" w:firstRow="0" w:lastRow="0" w:firstColumn="0" w:lastColumn="0" w:oddVBand="0" w:evenVBand="0" w:oddHBand="0" w:evenHBand="0" w:firstRowFirstColumn="0" w:firstRowLastColumn="0" w:lastRowFirstColumn="0" w:lastRowLastColumn="0"/>
             </w:pPr>
             <w:r>
-              <w:t>resnet18_finetune (image)</w:t>
+              <w:t>16.50 +/- 2.69</w:t>
             </w:r>
           </w:p>
         </w:tc>
         <w:tc>
           <w:tcPr>
-            <w:tcW w:w="2789" w:type="dxa"/>
+            <w:cnfStyle w:val="000010000000" w:firstRow="0" w:lastRow="0" w:firstColumn="0" w:lastColumn="0" w:oddVBand="1" w:evenVBand="0" w:oddHBand="0" w:evenHBand="0" w:firstRowFirstColumn="0" w:firstRowLastColumn="0" w:lastRowFirstColumn="0" w:lastRowLastColumn="0"/>
+            <w:tcW w:w="0" w:type="auto"/>
           </w:tcPr>
           <w:p>
             <w:pPr>
+              <w:spacing w:after="140"/>
+              <w:jc w:val="both"/>
+            </w:pPr>
+            <w:r>
+              <w:t>0.45</w:t>
+            </w:r>
+          </w:p>
+        </w:tc>
+        <w:tc>
+          <w:tcPr>
+            <w:tcW w:w="0" w:type="auto"/>
+          </w:tcPr>
+          <w:p>
+            <w:pPr>
+              <w:spacing w:after="140"/>
               <w:jc w:val="both"/>
               <w:cnfStyle w:val="000000000000" w:firstRow="0" w:lastRow="0" w:firstColumn="0" w:lastColumn="0" w:oddVBand="0" w:evenVBand="0" w:oddHBand="0" w:evenHBand="0" w:firstRowFirstColumn="0" w:firstRowLastColumn="0" w:lastRowFirstColumn="0" w:lastRowLastColumn="0"/>
             </w:pPr>
             <w:r>
-              <w:t>18.232</w:t>
+              <w:t>image</w:t>
             </w:r>
           </w:p>
         </w:tc>
@@ -1197,106 +1285,135 @@
       <w:tr>
         <w:trPr>
           <w:cnfStyle w:val="000000100000" w:firstRow="0" w:lastRow="0" w:firstColumn="0" w:lastColumn="0" w:oddVBand="0" w:evenVBand="0" w:oddHBand="1" w:evenHBand="0" w:firstRowFirstColumn="0" w:firstRowLastColumn="0" w:lastRowFirstColumn="0" w:lastRowLastColumn="0"/>
-          <w:trHeight w:val="342"/>
-          <w:jc w:val="center"/>
+          <w:trHeight w:val="375"/>
         </w:trPr>
         <w:tc>
           <w:tcPr>
-            <w:cnfStyle w:val="001000000000" w:firstRow="0" w:lastRow="0" w:firstColumn="1" w:lastColumn="0" w:oddVBand="0" w:evenVBand="0" w:oddHBand="0" w:evenHBand="0" w:firstRowFirstColumn="0" w:firstRowLastColumn="0" w:lastRowFirstColumn="0" w:lastRowLastColumn="0"/>
-            <w:tcW w:w="773" w:type="dxa"/>
+            <w:cnfStyle w:val="000010000000" w:firstRow="0" w:lastRow="0" w:firstColumn="0" w:lastColumn="0" w:oddVBand="1" w:evenVBand="0" w:oddHBand="0" w:evenHBand="0" w:firstRowFirstColumn="0" w:firstRowLastColumn="0" w:lastRowFirstColumn="0" w:lastRowLastColumn="0"/>
+            <w:tcW w:w="0" w:type="auto"/>
           </w:tcPr>
           <w:p>
             <w:pPr>
+              <w:spacing w:after="140"/>
               <w:jc w:val="both"/>
             </w:pPr>
             <w:r>
-              <w:t>3</w:t>
+              <w:t>ResNet18 fine-tuned</w:t>
             </w:r>
           </w:p>
         </w:tc>
         <w:tc>
           <w:tcPr>
-            <w:tcW w:w="3571" w:type="dxa"/>
+            <w:tcW w:w="0" w:type="auto"/>
           </w:tcPr>
           <w:p>
             <w:pPr>
+              <w:spacing w:after="140"/>
               <w:jc w:val="both"/>
               <w:cnfStyle w:val="000000100000" w:firstRow="0" w:lastRow="0" w:firstColumn="0" w:lastColumn="0" w:oddVBand="0" w:evenVBand="0" w:oddHBand="1" w:evenHBand="0" w:firstRowFirstColumn="0" w:firstRowLastColumn="0" w:lastRowFirstColumn="0" w:lastRowLastColumn="0"/>
             </w:pPr>
-            <w:proofErr w:type="spellStart"/>
             <w:r>
-              <w:t>simple_cnn</w:t>
-            </w:r>
-            <w:proofErr w:type="spellEnd"/>
-            <w:r>
-              <w:t xml:space="preserve"> (image)</w:t>
+              <w:t>16.83 +/- 2.83</w:t>
             </w:r>
           </w:p>
         </w:tc>
         <w:tc>
           <w:tcPr>
-            <w:tcW w:w="2789" w:type="dxa"/>
+            <w:cnfStyle w:val="000010000000" w:firstRow="0" w:lastRow="0" w:firstColumn="0" w:lastColumn="0" w:oddVBand="1" w:evenVBand="0" w:oddHBand="0" w:evenHBand="0" w:firstRowFirstColumn="0" w:firstRowLastColumn="0" w:lastRowFirstColumn="0" w:lastRowLastColumn="0"/>
+            <w:tcW w:w="0" w:type="auto"/>
           </w:tcPr>
           <w:p>
             <w:pPr>
+              <w:spacing w:after="140"/>
+              <w:jc w:val="both"/>
+            </w:pPr>
+            <w:r>
+              <w:t>0.47</w:t>
+            </w:r>
+          </w:p>
+        </w:tc>
+        <w:tc>
+          <w:tcPr>
+            <w:tcW w:w="0" w:type="auto"/>
+          </w:tcPr>
+          <w:p>
+            <w:pPr>
+              <w:spacing w:after="140"/>
               <w:jc w:val="both"/>
               <w:cnfStyle w:val="000000100000" w:firstRow="0" w:lastRow="0" w:firstColumn="0" w:lastColumn="0" w:oddVBand="0" w:evenVBand="0" w:oddHBand="1" w:evenHBand="0" w:firstRowFirstColumn="0" w:firstRowLastColumn="0" w:lastRowFirstColumn="0" w:lastRowLastColumn="0"/>
             </w:pPr>
             <w:r>
-              <w:t>18.699</w:t>
+              <w:t>image</w:t>
             </w:r>
           </w:p>
         </w:tc>
       </w:tr>
       <w:tr>
         <w:trPr>
-          <w:trHeight w:val="342"/>
-          <w:jc w:val="center"/>
+          <w:trHeight w:val="375"/>
         </w:trPr>
         <w:tc>
           <w:tcPr>
-            <w:cnfStyle w:val="001000000000" w:firstRow="0" w:lastRow="0" w:firstColumn="1" w:lastColumn="0" w:oddVBand="0" w:evenVBand="0" w:oddHBand="0" w:evenHBand="0" w:firstRowFirstColumn="0" w:firstRowLastColumn="0" w:lastRowFirstColumn="0" w:lastRowLastColumn="0"/>
-            <w:tcW w:w="773" w:type="dxa"/>
+            <w:cnfStyle w:val="000010000000" w:firstRow="0" w:lastRow="0" w:firstColumn="0" w:lastColumn="0" w:oddVBand="1" w:evenVBand="0" w:oddHBand="0" w:evenHBand="0" w:firstRowFirstColumn="0" w:firstRowLastColumn="0" w:lastRowFirstColumn="0" w:lastRowLastColumn="0"/>
+            <w:tcW w:w="0" w:type="auto"/>
           </w:tcPr>
           <w:p>
             <w:pPr>
+              <w:spacing w:after="140"/>
               <w:jc w:val="both"/>
             </w:pPr>
+            <w:proofErr w:type="spellStart"/>
             <w:r>
-              <w:t>4</w:t>
+              <w:t>SimpleCNN</w:t>
+            </w:r>
+            <w:proofErr w:type="spellEnd"/>
+            <w:r>
+              <w:t xml:space="preserve"> (from scratch)</w:t>
             </w:r>
           </w:p>
         </w:tc>
         <w:tc>
           <w:tcPr>
-            <w:tcW w:w="3571" w:type="dxa"/>
+            <w:tcW w:w="0" w:type="auto"/>
           </w:tcPr>
           <w:p>
             <w:pPr>
+              <w:spacing w:after="140"/>
               <w:jc w:val="both"/>
               <w:cnfStyle w:val="000000000000" w:firstRow="0" w:lastRow="0" w:firstColumn="0" w:lastColumn="0" w:oddVBand="0" w:evenVBand="0" w:oddHBand="0" w:evenHBand="0" w:firstRowFirstColumn="0" w:firstRowLastColumn="0" w:lastRowFirstColumn="0" w:lastRowLastColumn="0"/>
             </w:pPr>
-            <w:proofErr w:type="spellStart"/>
             <w:r>
-              <w:t>naive_median</w:t>
-            </w:r>
-            <w:proofErr w:type="spellEnd"/>
-            <w:r>
-              <w:t xml:space="preserve"> (tabular)</w:t>
+              <w:t>18.08 +/- 3.47</w:t>
             </w:r>
           </w:p>
         </w:tc>
         <w:tc>
           <w:tcPr>
-            <w:tcW w:w="2789" w:type="dxa"/>
+            <w:cnfStyle w:val="000010000000" w:firstRow="0" w:lastRow="0" w:firstColumn="0" w:lastColumn="0" w:oddVBand="1" w:evenVBand="0" w:oddHBand="0" w:evenHBand="0" w:firstRowFirstColumn="0" w:firstRowLastColumn="0" w:lastRowFirstColumn="0" w:lastRowLastColumn="0"/>
+            <w:tcW w:w="0" w:type="auto"/>
           </w:tcPr>
           <w:p>
             <w:pPr>
+              <w:spacing w:after="140"/>
+              <w:jc w:val="both"/>
+            </w:pPr>
+            <w:r>
+              <w:t>–</w:t>
+            </w:r>
+          </w:p>
+        </w:tc>
+        <w:tc>
+          <w:tcPr>
+            <w:tcW w:w="0" w:type="auto"/>
+          </w:tcPr>
+          <w:p>
+            <w:pPr>
+              <w:spacing w:after="140"/>
               <w:jc w:val="both"/>
               <w:cnfStyle w:val="000000000000" w:firstRow="0" w:lastRow="0" w:firstColumn="0" w:lastColumn="0" w:oddVBand="0" w:evenVBand="0" w:oddHBand="0" w:evenHBand="0" w:firstRowFirstColumn="0" w:firstRowLastColumn="0" w:lastRowFirstColumn="0" w:lastRowLastColumn="0"/>
             </w:pPr>
             <w:r>
-              <w:t>24.117</w:t>
+              <w:t>image</w:t>
             </w:r>
           </w:p>
         </w:tc>
@@ -1304,54 +1421,130 @@
       <w:tr>
         <w:trPr>
           <w:cnfStyle w:val="000000100000" w:firstRow="0" w:lastRow="0" w:firstColumn="0" w:lastColumn="0" w:oddVBand="0" w:evenVBand="0" w:oddHBand="1" w:evenHBand="0" w:firstRowFirstColumn="0" w:firstRowLastColumn="0" w:lastRowFirstColumn="0" w:lastRowLastColumn="0"/>
-          <w:trHeight w:val="342"/>
-          <w:jc w:val="center"/>
+          <w:trHeight w:val="390"/>
         </w:trPr>
         <w:tc>
           <w:tcPr>
-            <w:cnfStyle w:val="001000000000" w:firstRow="0" w:lastRow="0" w:firstColumn="1" w:lastColumn="0" w:oddVBand="0" w:evenVBand="0" w:oddHBand="0" w:evenHBand="0" w:firstRowFirstColumn="0" w:firstRowLastColumn="0" w:lastRowFirstColumn="0" w:lastRowLastColumn="0"/>
-            <w:tcW w:w="773" w:type="dxa"/>
+            <w:cnfStyle w:val="000010000000" w:firstRow="0" w:lastRow="0" w:firstColumn="0" w:lastColumn="0" w:oddVBand="1" w:evenVBand="0" w:oddHBand="0" w:evenHBand="0" w:firstRowFirstColumn="0" w:firstRowLastColumn="0" w:lastRowFirstColumn="0" w:lastRowLastColumn="0"/>
+            <w:tcW w:w="0" w:type="auto"/>
           </w:tcPr>
           <w:p>
             <w:pPr>
+              <w:spacing w:after="140"/>
               <w:jc w:val="both"/>
-              <w:rPr>
-                <w:lang w:val="ru-RU"/>
-              </w:rPr>
             </w:pPr>
             <w:r>
-              <w:rPr>
-                <w:lang w:val="ru-RU"/>
-              </w:rPr>
-              <w:t>5</w:t>
+              <w:t>ResNet18 frozen</w:t>
             </w:r>
           </w:p>
         </w:tc>
         <w:tc>
           <w:tcPr>
-            <w:tcW w:w="3571" w:type="dxa"/>
+            <w:tcW w:w="0" w:type="auto"/>
           </w:tcPr>
           <w:p>
             <w:pPr>
+              <w:spacing w:after="140"/>
               <w:jc w:val="both"/>
               <w:cnfStyle w:val="000000100000" w:firstRow="0" w:lastRow="0" w:firstColumn="0" w:lastColumn="0" w:oddVBand="0" w:evenVBand="0" w:oddHBand="1" w:evenHBand="0" w:firstRowFirstColumn="0" w:firstRowLastColumn="0" w:lastRowFirstColumn="0" w:lastRowLastColumn="0"/>
             </w:pPr>
             <w:r>
-              <w:t>resnet18_frozen (image)</w:t>
+              <w:t>23.05 +/- 2.13</w:t>
             </w:r>
           </w:p>
         </w:tc>
         <w:tc>
           <w:tcPr>
-            <w:tcW w:w="2789" w:type="dxa"/>
+            <w:cnfStyle w:val="000010000000" w:firstRow="0" w:lastRow="0" w:firstColumn="0" w:lastColumn="0" w:oddVBand="1" w:evenVBand="0" w:oddHBand="0" w:evenHBand="0" w:firstRowFirstColumn="0" w:firstRowLastColumn="0" w:lastRowFirstColumn="0" w:lastRowLastColumn="0"/>
+            <w:tcW w:w="0" w:type="auto"/>
           </w:tcPr>
           <w:p>
             <w:pPr>
+              <w:spacing w:after="140"/>
+              <w:jc w:val="both"/>
+            </w:pPr>
+            <w:r>
+              <w:t>–</w:t>
+            </w:r>
+          </w:p>
+        </w:tc>
+        <w:tc>
+          <w:tcPr>
+            <w:tcW w:w="0" w:type="auto"/>
+          </w:tcPr>
+          <w:p>
+            <w:pPr>
+              <w:spacing w:after="140"/>
               <w:jc w:val="both"/>
               <w:cnfStyle w:val="000000100000" w:firstRow="0" w:lastRow="0" w:firstColumn="0" w:lastColumn="0" w:oddVBand="0" w:evenVBand="0" w:oddHBand="1" w:evenHBand="0" w:firstRowFirstColumn="0" w:firstRowLastColumn="0" w:lastRowFirstColumn="0" w:lastRowLastColumn="0"/>
             </w:pPr>
             <w:r>
-              <w:t>24.742</w:t>
+              <w:t>image</w:t>
+            </w:r>
+          </w:p>
+        </w:tc>
+      </w:tr>
+      <w:tr>
+        <w:trPr>
+          <w:trHeight w:val="361"/>
+        </w:trPr>
+        <w:tc>
+          <w:tcPr>
+            <w:cnfStyle w:val="000010000000" w:firstRow="0" w:lastRow="0" w:firstColumn="0" w:lastColumn="0" w:oddVBand="1" w:evenVBand="0" w:oddHBand="0" w:evenHBand="0" w:firstRowFirstColumn="0" w:firstRowLastColumn="0" w:lastRowFirstColumn="0" w:lastRowLastColumn="0"/>
+            <w:tcW w:w="0" w:type="auto"/>
+          </w:tcPr>
+          <w:p>
+            <w:pPr>
+              <w:spacing w:after="140"/>
+              <w:jc w:val="both"/>
+            </w:pPr>
+            <w:r>
+              <w:t>Naive median</w:t>
+            </w:r>
+          </w:p>
+        </w:tc>
+        <w:tc>
+          <w:tcPr>
+            <w:tcW w:w="0" w:type="auto"/>
+          </w:tcPr>
+          <w:p>
+            <w:pPr>
+              <w:spacing w:after="140"/>
+              <w:jc w:val="both"/>
+              <w:cnfStyle w:val="000000000000" w:firstRow="0" w:lastRow="0" w:firstColumn="0" w:lastColumn="0" w:oddVBand="0" w:evenVBand="0" w:oddHBand="0" w:evenHBand="0" w:firstRowFirstColumn="0" w:firstRowLastColumn="0" w:lastRowFirstColumn="0" w:lastRowLastColumn="0"/>
+            </w:pPr>
+            <w:r>
+              <w:t>24.12 +/- 4.66</w:t>
+            </w:r>
+          </w:p>
+        </w:tc>
+        <w:tc>
+          <w:tcPr>
+            <w:cnfStyle w:val="000010000000" w:firstRow="0" w:lastRow="0" w:firstColumn="0" w:lastColumn="0" w:oddVBand="1" w:evenVBand="0" w:oddHBand="0" w:evenHBand="0" w:firstRowFirstColumn="0" w:firstRowLastColumn="0" w:lastRowFirstColumn="0" w:lastRowLastColumn="0"/>
+            <w:tcW w:w="0" w:type="auto"/>
+          </w:tcPr>
+          <w:p>
+            <w:pPr>
+              <w:spacing w:after="140"/>
+              <w:jc w:val="both"/>
+            </w:pPr>
+            <w:r>
+              <w:t>-0.08</w:t>
+            </w:r>
+          </w:p>
+        </w:tc>
+        <w:tc>
+          <w:tcPr>
+            <w:tcW w:w="0" w:type="auto"/>
+          </w:tcPr>
+          <w:p>
+            <w:pPr>
+              <w:spacing w:after="140"/>
+              <w:jc w:val="both"/>
+              <w:cnfStyle w:val="000000000000" w:firstRow="0" w:lastRow="0" w:firstColumn="0" w:lastColumn="0" w:oddVBand="0" w:evenVBand="0" w:oddHBand="0" w:evenHBand="0" w:firstRowFirstColumn="0" w:firstRowLastColumn="0" w:lastRowFirstColumn="0" w:lastRowLastColumn="0"/>
+            </w:pPr>
+            <w:r>
+              <w:t>floor</w:t>
             </w:r>
           </w:p>
         </w:tc>
@@ -1359,23 +1552,20 @@
     </w:tbl>
     <w:p>
       <w:pPr>
-        <w:spacing w:after="160"/>
-        <w:ind w:firstLine="360"/>
-        <w:jc w:val="center"/>
-      </w:pPr>
-      <w:r>
-        <w:rPr>
-          <w:b/>
-          <w:bCs/>
-        </w:rPr>
-        <w:t xml:space="preserve">Table 1. </w:t>
-      </w:r>
-      <w:r>
-        <w:rPr>
-          <w:i/>
-          <w:iCs/>
-        </w:rPr>
-        <w:t>Model comparison by weighted RMSE (lower is better) and R2 on total biomass.</w:t>
+        <w:spacing w:after="140"/>
+        <w:ind w:firstLine="360"/>
+        <w:jc w:val="both"/>
+      </w:pPr>
+      <w:r>
+        <w:t xml:space="preserve">A final deployable </w:t>
+      </w:r>
+      <w:proofErr w:type="spellStart"/>
+      <w:r>
+        <w:t>ResNet</w:t>
+      </w:r>
+      <w:proofErr w:type="spellEnd"/>
+      <w:r>
+        <w:t xml:space="preserve"> model trained on an enlarged train split reached 15.94 on a single holdout; the table reports the more conservative cross-validated figures.</w:t>
       </w:r>
     </w:p>
     <w:p>
@@ -1405,11 +1595,28 @@
           <w:b/>
           <w:bCs/>
         </w:rPr>
-        <w:t xml:space="preserve">): </w:t>
-      </w:r>
-      <w:r>
-        <w:t>Green 0.79, GDM 0.80, Total 0.72, Clover 0.65, Dead 0.39. Feature importance: Height (0.57) and NDVI (0.24) dominate (81% combined), consistent with the EDA.</w:t>
-      </w:r>
+        <w:t>):</w:t>
+      </w:r>
+      <w:r>
+        <w:t xml:space="preserve"> Green 0.79, GDM 0.80, Total 0.72, Clover 0.65, Dead 0.39. </w:t>
+      </w:r>
+      <w:r>
+        <w:rPr>
+          <w:b/>
+          <w:bCs/>
+        </w:rPr>
+        <w:t>Feature importance:</w:t>
+      </w:r>
+      <w:r>
+        <w:t xml:space="preserve"> Height (0.57) and NDVI (0.24) dominate (81% combined), consistent with the EDA.</w:t>
+      </w:r>
+    </w:p>
+    <w:p>
+      <w:pPr>
+        <w:spacing w:after="140"/>
+        <w:ind w:firstLine="360"/>
+        <w:jc w:val="both"/>
+      </w:pPr>
     </w:p>
     <w:p>
       <w:pPr>
@@ -1513,605 +1720,844 @@
           <w:b/>
           <w:bCs/>
         </w:rPr>
-        <w:t xml:space="preserve">Image per-target R2 (fine-tuned </w:t>
+        <w:lastRenderedPageBreak/>
+        <w:t>Image per-target R2 (DINOv2 frozen, best image model):</w:t>
+      </w:r>
+      <w:r>
+        <w:t xml:space="preserve"> Green 0.56, GDM 0.51, Clover 0.48, Total 0.45, Dead 0.16. DINOv2 is strongest on green/GDM and weakest on dead matter, which is hard to read from a top-down photo.</w:t>
+      </w:r>
+    </w:p>
+    <w:p>
+      <w:pPr>
+        <w:pStyle w:val="Heading1"/>
+        <w:ind w:firstLine="360"/>
+        <w:rPr>
+          <w:color w:val="215E99" w:themeColor="text2" w:themeTint="BF"/>
+        </w:rPr>
+      </w:pPr>
+      <w:r>
+        <w:rPr>
+          <w:color w:val="215E99" w:themeColor="text2" w:themeTint="BF"/>
+        </w:rPr>
+        <w:t>6. Analysis</w:t>
+      </w:r>
+    </w:p>
+    <w:p>
+      <w:pPr>
+        <w:spacing w:after="140"/>
+        <w:ind w:firstLine="360"/>
+        <w:jc w:val="both"/>
+      </w:pPr>
+      <w:r>
+        <w:t xml:space="preserve">This study yields </w:t>
+      </w:r>
+      <w:r>
+        <w:rPr>
+          <w:b/>
+          <w:bCs/>
+        </w:rPr>
+        <w:t>two key results</w:t>
+      </w:r>
+      <w:r>
+        <w:t>, both supported by the 5-fold comparison.</w:t>
+      </w:r>
+    </w:p>
+    <w:p>
+      <w:pPr>
+        <w:spacing w:after="140"/>
+        <w:ind w:firstLine="360"/>
+        <w:jc w:val="both"/>
+        <w:rPr>
+          <w:b/>
+          <w:bCs/>
+          <w:color w:val="215E99" w:themeColor="text2" w:themeTint="BF"/>
+        </w:rPr>
+      </w:pPr>
+      <w:bookmarkStart w:id="0" w:name="Xab0b6c1e3ab847728aec0a56aa22b97b4108e22"/>
+      <w:r>
+        <w:rPr>
+          <w:b/>
+          <w:bCs/>
+          <w:color w:val="215E99" w:themeColor="text2" w:themeTint="BF"/>
+        </w:rPr>
+        <w:t>Key result 1 — Modality: cheap ground measurements beat imagery</w:t>
+      </w:r>
+    </w:p>
+    <w:p>
+      <w:pPr>
+        <w:spacing w:after="140"/>
+        <w:ind w:firstLine="360"/>
+        <w:jc w:val="both"/>
+      </w:pPr>
+      <w:r>
+        <w:t xml:space="preserve">The </w:t>
       </w:r>
       <w:proofErr w:type="spellStart"/>
       <w:r>
-        <w:rPr>
-          <w:b/>
-          <w:bCs/>
-        </w:rPr>
-        <w:t>ResNet</w:t>
+        <w:t>RandomForest</w:t>
       </w:r>
       <w:proofErr w:type="spellEnd"/>
       <w:r>
-        <w:rPr>
-          <w:b/>
-          <w:bCs/>
-        </w:rPr>
-        <w:t xml:space="preserve">): </w:t>
-      </w:r>
-      <w:r>
-        <w:t xml:space="preserve">Green 0.49, GDM 0.42, Total 0.33, Dead 0.27, Clover 0.30. The image model </w:t>
+        <w:t xml:space="preserve"> on NDVI + height (11.83 +/- 1.73) is the best model overall, ahead of the best image model, DINOv2 frozen (16.50 +/- </w:t>
       </w:r>
       <w:proofErr w:type="gramStart"/>
       <w:r>
-        <w:t>is beaten</w:t>
+        <w:t>2.69) —</w:t>
       </w:r>
       <w:proofErr w:type="gramEnd"/>
       <w:r>
-        <w:t xml:space="preserve"> by the </w:t>
-      </w:r>
-      <w:proofErr w:type="spellStart"/>
-      <w:r>
-        <w:t>RandomForest</w:t>
-      </w:r>
-      <w:proofErr w:type="spellEnd"/>
-      <w:r>
-        <w:t xml:space="preserve"> on every single target; the largest gaps are GDM (0.42 vs 0.80) and clover (0.30 vs 0.65).</w:t>
-      </w:r>
-    </w:p>
-    <w:p>
-      <w:pPr>
-        <w:pStyle w:val="Heading1"/>
-        <w:ind w:firstLine="360"/>
-      </w:pPr>
-      <w:r>
-        <w:t>6. Analysis</w:t>
-      </w:r>
-    </w:p>
-    <w:p>
-      <w:pPr>
-        <w:spacing w:after="140"/>
-        <w:ind w:firstLine="360"/>
-        <w:jc w:val="both"/>
-      </w:pPr>
-      <w:r>
-        <w:rPr>
-          <w:b/>
-          <w:bCs/>
-        </w:rPr>
-        <w:t xml:space="preserve">1. Metadata outperforms imagery. </w:t>
-      </w:r>
-      <w:proofErr w:type="gramStart"/>
-      <w:r>
-        <w:t xml:space="preserve">The </w:t>
-      </w:r>
-      <w:proofErr w:type="spellStart"/>
-      <w:r>
-        <w:t>RandomForest</w:t>
-      </w:r>
-      <w:proofErr w:type="spellEnd"/>
-      <w:proofErr w:type="gramEnd"/>
-      <w:r>
-        <w:t xml:space="preserve"> on two cheap ground measurements (11.83) beats the best image model (18.23) by ~35%. On 357 samples, the direct physical signal in NDVI/height beats what a CNN extracts from raw pixels. This is the project's central, quantified conclusion.</w:t>
-      </w:r>
-    </w:p>
-    <w:p>
-      <w:pPr>
-        <w:spacing w:after="140"/>
-        <w:ind w:firstLine="360"/>
-        <w:jc w:val="both"/>
-      </w:pPr>
-      <w:r>
-        <w:rPr>
-          <w:b/>
-          <w:bCs/>
-        </w:rPr>
-        <w:lastRenderedPageBreak/>
-        <w:t xml:space="preserve">2. Fine-tuning is essential; feature extraction fails. </w:t>
-      </w:r>
-      <w:r>
-        <w:t xml:space="preserve">The frozen </w:t>
-      </w:r>
-      <w:proofErr w:type="spellStart"/>
-      <w:r>
-        <w:t>ResNet</w:t>
-      </w:r>
-      <w:proofErr w:type="spellEnd"/>
-      <w:r>
-        <w:t xml:space="preserve"> (24.74) performs worse than the naive median (24.12): </w:t>
-      </w:r>
-      <w:proofErr w:type="spellStart"/>
-      <w:r>
-        <w:t>unadapted</w:t>
-      </w:r>
-      <w:proofErr w:type="spellEnd"/>
-      <w:r>
-        <w:t xml:space="preserve"> ImageNet features are useless for pasture. Unfreezing the backbone cuts error sharply. This contrast directly demonstrates the value of fine-tuning on small, domain-shifted data.</w:t>
-      </w:r>
-    </w:p>
-    <w:p>
-      <w:pPr>
-        <w:spacing w:after="140"/>
-        <w:ind w:firstLine="360"/>
-        <w:jc w:val="both"/>
-      </w:pPr>
-      <w:r>
-        <w:rPr>
-          <w:b/>
-          <w:bCs/>
-        </w:rPr>
-        <w:t xml:space="preserve">3. A small from-scratch CNN matches fine-tuning. </w:t>
-      </w:r>
-      <w:r>
-        <w:t xml:space="preserve">The compact network trained on-task (18.70) is statistically indistinguishable from fine-tuning (18.23) and clearly beats the frozen </w:t>
-      </w:r>
-      <w:proofErr w:type="spellStart"/>
-      <w:r>
-        <w:t>ResNet</w:t>
-      </w:r>
-      <w:proofErr w:type="spellEnd"/>
-      <w:r>
-        <w:t xml:space="preserve"> (</w:t>
-      </w:r>
-      <w:proofErr w:type="gramStart"/>
-      <w:r>
-        <w:t>24.74) —</w:t>
-      </w:r>
-      <w:proofErr w:type="gramEnd"/>
-      <w:r>
-        <w:t xml:space="preserve"> on small data, "small + adapted" beats "large + borrowed".</w:t>
-      </w:r>
-    </w:p>
-    <w:p>
-      <w:pPr>
-        <w:spacing w:after="140"/>
-        <w:ind w:firstLine="360"/>
-        <w:jc w:val="both"/>
-      </w:pPr>
-      <w:r>
-        <w:rPr>
-          <w:b/>
-          <w:bCs/>
-        </w:rPr>
-        <w:t xml:space="preserve">4. Where imagery is weakest. </w:t>
-      </w:r>
-      <w:r>
-        <w:t xml:space="preserve">Dead matter (R2 0.27) and clover (0.30) have the lowest image R2: dead biomass and scattered clover are hard to read from a top-down photo. The image model </w:t>
-      </w:r>
-      <w:proofErr w:type="gramStart"/>
-      <w:r>
-        <w:t>is beaten</w:t>
-      </w:r>
-      <w:proofErr w:type="gramEnd"/>
-      <w:r>
-        <w:t xml:space="preserve"> by the </w:t>
-      </w:r>
-      <w:proofErr w:type="spellStart"/>
-      <w:r>
-        <w:t>RandomForest</w:t>
-      </w:r>
-      <w:proofErr w:type="spellEnd"/>
-      <w:r>
-        <w:t xml:space="preserve"> on every target.</w:t>
-      </w:r>
-    </w:p>
-    <w:p>
-      <w:pPr>
-        <w:spacing w:after="140"/>
-        <w:ind w:firstLine="360"/>
-        <w:jc w:val="both"/>
-      </w:pPr>
-      <w:r>
-        <w:rPr>
-          <w:b/>
-          <w:bCs/>
-        </w:rPr>
-        <w:t xml:space="preserve">Methodological note. </w:t>
-      </w:r>
-      <w:r>
-        <w:t xml:space="preserve">Fine-tuning showed early-epoch validation instability; early stopping on validation weighted-RMSE </w:t>
-      </w:r>
-      <w:proofErr w:type="gramStart"/>
-      <w:r>
-        <w:t>was used</w:t>
-      </w:r>
-      <w:proofErr w:type="gramEnd"/>
-      <w:r>
-        <w:t xml:space="preserve"> to select the best epoch.</w:t>
-      </w:r>
-    </w:p>
-    <w:p>
-      <w:pPr>
-        <w:spacing w:after="140"/>
-        <w:ind w:firstLine="360"/>
-        <w:jc w:val="both"/>
-      </w:pPr>
-      <w:r>
-        <w:rPr>
-          <w:b/>
-          <w:bCs/>
-        </w:rPr>
-        <w:t xml:space="preserve">Interpretation. </w:t>
-      </w:r>
-      <w:r>
-        <w:t>For this dataset and scale, the image does not add predictive value beyond cheap ground measurements — it underperforms them. Practically, where NDVI/height are available they are the better and cheaper predictor. The image-only model remains useful only in the field scenario where such measurements are unavailable, which is exactly what the deployed app targets.</w:t>
-      </w:r>
-    </w:p>
-    <w:p>
-      <w:pPr>
-        <w:pStyle w:val="Heading1"/>
-        <w:ind w:firstLine="360"/>
-      </w:pPr>
-      <w:r>
-        <w:t>7. Deployment</w:t>
-      </w:r>
-    </w:p>
-    <w:p>
-      <w:pPr>
-        <w:spacing w:after="140"/>
-        <w:ind w:firstLine="360"/>
-        <w:jc w:val="both"/>
-      </w:pPr>
-      <w:r>
-        <w:t xml:space="preserve">A </w:t>
-      </w:r>
-      <w:proofErr w:type="spellStart"/>
-      <w:r>
-        <w:t>Gradio</w:t>
-      </w:r>
-      <w:proofErr w:type="spellEnd"/>
-      <w:r>
-        <w:t xml:space="preserve"> app (</w:t>
-      </w:r>
-      <w:proofErr w:type="spellStart"/>
-      <w:r>
-        <w:t>src</w:t>
-      </w:r>
-      <w:proofErr w:type="spellEnd"/>
-      <w:r>
-        <w:t xml:space="preserve">/app.py) serves the image-only fine-tuned </w:t>
-      </w:r>
-      <w:proofErr w:type="spellStart"/>
-      <w:r>
-        <w:t>ResNet</w:t>
-      </w:r>
-      <w:proofErr w:type="spellEnd"/>
-      <w:r>
-        <w:t xml:space="preserve">: a user uploads a quadrat photo and receives the five biomass estimates plus a short grazing-quality summary (total biomass, green share). It </w:t>
-      </w:r>
-      <w:proofErr w:type="gramStart"/>
-      <w:r>
-        <w:t>is deployed</w:t>
-      </w:r>
-      <w:proofErr w:type="gramEnd"/>
-      <w:r>
-        <w:t xml:space="preserve"> to Hugging Face Spaces </w:t>
-      </w:r>
-      <w:r>
-        <w:rPr>
-          <w:highlight w:val="yellow"/>
-        </w:rPr>
-        <w:t>[link TBD].</w:t>
-      </w:r>
-    </w:p>
-    <w:p>
-      <w:pPr>
-        <w:shd w:val="clear" w:color="auto" w:fill="F2F2F2"/>
-        <w:spacing w:before="120" w:after="20"/>
-        <w:ind w:firstLine="360"/>
-        <w:jc w:val="center"/>
-      </w:pPr>
-      <w:proofErr w:type="gramStart"/>
-      <w:r>
-        <w:rPr>
-          <w:b/>
-          <w:bCs/>
-          <w:color w:val="C00000"/>
-          <w:highlight w:val="yellow"/>
-        </w:rPr>
-        <w:t>[ INSERT</w:t>
-      </w:r>
-      <w:proofErr w:type="gramEnd"/>
-      <w:r>
-        <w:rPr>
-          <w:b/>
-          <w:bCs/>
-          <w:color w:val="C00000"/>
-          <w:highlight w:val="yellow"/>
-        </w:rPr>
-        <w:t xml:space="preserve"> Figure 6 </w:t>
-      </w:r>
-      <w:proofErr w:type="gramStart"/>
-      <w:r>
-        <w:rPr>
-          <w:b/>
-          <w:bCs/>
-          <w:color w:val="C00000"/>
-          <w:highlight w:val="yellow"/>
-        </w:rPr>
-        <w:t>HERE ]</w:t>
-      </w:r>
-      <w:proofErr w:type="gramEnd"/>
+        <w:t xml:space="preserve"> a 28.3% lower weighted RMSE. On 357 samples, the direct physical signal in NDVI/height is more informative than anything a network extracts from raw pixels.</w:t>
+      </w:r>
+    </w:p>
+    <w:p>
+      <w:pPr>
+        <w:spacing w:after="140"/>
+        <w:ind w:firstLine="360"/>
+        <w:jc w:val="both"/>
+      </w:pPr>
       <w:r>
         <w:rPr>
           <w:i/>
           <w:iCs/>
-          <w:color w:val="808080"/>
-          <w:highlight w:val="yellow"/>
-        </w:rPr>
-        <w:t xml:space="preserve">  </w:t>
+        </w:rPr>
+        <w:t>Statistical support.</w:t>
+      </w:r>
+      <w:r>
+        <w:t xml:space="preserve"> A paired Wilcoxon test across the 5 folds gives statistic=0, p=0.0625: </w:t>
+      </w:r>
+      <w:proofErr w:type="spellStart"/>
+      <w:r>
+        <w:t>RandomForest</w:t>
+      </w:r>
+      <w:proofErr w:type="spellEnd"/>
+      <w:r>
+        <w:t xml:space="preserve"> beat DINOv2 in </w:t>
+      </w:r>
+      <w:r>
+        <w:rPr>
+          <w:b/>
+          <w:bCs/>
+        </w:rPr>
+        <w:t>all five folds</w:t>
+      </w:r>
+      <w:r>
+        <w:t xml:space="preserve"> without exception (RF per-fold [12.0, 8.9, 11.8, 14.4, 12.0] vs DINOv2 [17.6, 11.7, 19.9, 17.0, 16.3]). With only 5 folds, p=0.0625 is the minimum achievable value, so this is the strongest possible consistency at this sample size, even though it does not cross the conventional 0.05 threshold. The RF gap (4.67) is 2.7x its own std (1.73), so the advantage is well outside RF's noise. Caveat: folds are grouped by image and therefore not fully independent.</w:t>
+      </w:r>
+    </w:p>
+    <w:p>
+      <w:pPr>
+        <w:spacing w:after="140"/>
+        <w:ind w:firstLine="360"/>
+        <w:jc w:val="both"/>
+        <w:rPr>
+          <w:b/>
+          <w:bCs/>
+          <w:color w:val="215E99" w:themeColor="text2" w:themeTint="BF"/>
+        </w:rPr>
+      </w:pPr>
+      <w:bookmarkStart w:id="1" w:name="X781297d0ec736bfb0351ecf2031993c1b5f2f49"/>
+      <w:bookmarkEnd w:id="0"/>
+      <w:r>
+        <w:rPr>
+          <w:b/>
+          <w:bCs/>
+          <w:color w:val="215E99" w:themeColor="text2" w:themeTint="BF"/>
+        </w:rPr>
+        <w:t>Key result 2 — Within imagery: pretraining quality outweighs fine-tuning</w:t>
+      </w:r>
+    </w:p>
+    <w:p>
+      <w:pPr>
+        <w:spacing w:after="140"/>
+        <w:ind w:firstLine="360"/>
+        <w:jc w:val="both"/>
+      </w:pPr>
+      <w:r>
+        <w:t>At the same frozen regime, ResNet18 (ImageNet) scores 23.05 — barely better than the naive median (</w:t>
       </w:r>
       <w:proofErr w:type="gramStart"/>
+      <w:r>
+        <w:t>24.12) —</w:t>
+      </w:r>
+      <w:proofErr w:type="gramEnd"/>
+      <w:r>
+        <w:t xml:space="preserve"> while DINOv2 (self-supervised) reaches 16.50, a 28.4% improvement. The only difference is the pretraining, so this isolates its effect: self-supervised features transfer to pasture far better than ImageNet features. Frozen DINOv2 (16.50) also matches fully fine-tuned </w:t>
+      </w:r>
+      <w:proofErr w:type="spellStart"/>
+      <w:r>
+        <w:t>ResNet</w:t>
+      </w:r>
+      <w:proofErr w:type="spellEnd"/>
+      <w:r>
+        <w:t xml:space="preserve"> (16.83); the gap is negligible (0.33, ~0.12 sigma), but the direction is notable — a strong frozen backbone equals a weaker fine-tuned one, so </w:t>
+      </w:r>
       <w:r>
         <w:rPr>
           <w:i/>
           <w:iCs/>
-          <w:color w:val="808080"/>
-          <w:highlight w:val="yellow"/>
-        </w:rPr>
-        <w:t>—  source</w:t>
+        </w:rPr>
+        <w:t>what the network was pretrained on matters as much as whether its backbone is adapted</w:t>
+      </w:r>
+      <w:r>
+        <w:t xml:space="preserve"> on this small dataset.</w:t>
+      </w:r>
+    </w:p>
+    <w:p>
+      <w:pPr>
+        <w:spacing w:after="140"/>
+        <w:ind w:firstLine="360"/>
+        <w:jc w:val="both"/>
+        <w:rPr>
+          <w:b/>
+          <w:bCs/>
+          <w:color w:val="215E99" w:themeColor="text2" w:themeTint="BF"/>
+        </w:rPr>
+      </w:pPr>
+      <w:bookmarkStart w:id="2" w:name="supporting-observations"/>
+      <w:bookmarkEnd w:id="1"/>
+      <w:r>
+        <w:rPr>
+          <w:b/>
+          <w:bCs/>
+          <w:color w:val="215E99" w:themeColor="text2" w:themeTint="BF"/>
+        </w:rPr>
+        <w:t>Supporting observations</w:t>
+      </w:r>
+    </w:p>
+    <w:p>
+      <w:pPr>
+        <w:spacing w:after="140"/>
+        <w:ind w:firstLine="360"/>
+        <w:jc w:val="both"/>
+      </w:pPr>
+      <w:r>
+        <w:rPr>
+          <w:b/>
+          <w:bCs/>
+        </w:rPr>
+        <w:t>Fine-tuning rescues a weak backbone.</w:t>
+      </w:r>
+      <w:r>
+        <w:t xml:space="preserve"> </w:t>
+      </w:r>
+      <w:proofErr w:type="spellStart"/>
+      <w:r>
+        <w:t>ResNet</w:t>
+      </w:r>
+      <w:proofErr w:type="spellEnd"/>
+      <w:r>
+        <w:t xml:space="preserve"> improves from 23.05 (frozen) to 16.83 (fine-tuned), a 27% gain: on a weak (ImageNet) backbone, adapting it is essential. DINOv2 needs no fine-tuning to reach the same level.</w:t>
+      </w:r>
+    </w:p>
+    <w:p>
+      <w:pPr>
+        <w:spacing w:after="140"/>
+        <w:ind w:firstLine="360"/>
+        <w:jc w:val="both"/>
+      </w:pPr>
+      <w:r>
+        <w:rPr>
+          <w:b/>
+          <w:bCs/>
+        </w:rPr>
+        <w:t>A small from-scratch CNN is competitive.</w:t>
+      </w:r>
+      <w:r>
+        <w:t xml:space="preserve"> </w:t>
+      </w:r>
+      <w:proofErr w:type="spellStart"/>
+      <w:r>
+        <w:t>SimpleCNN</w:t>
+      </w:r>
+      <w:proofErr w:type="spellEnd"/>
+      <w:r>
+        <w:t xml:space="preserve"> (18.08) is close to fine-tuned </w:t>
+      </w:r>
+      <w:proofErr w:type="spellStart"/>
+      <w:r>
+        <w:t>ResNet</w:t>
+      </w:r>
+      <w:proofErr w:type="spellEnd"/>
+      <w:r>
+        <w:t xml:space="preserve"> (16.83) and beats frozen </w:t>
+      </w:r>
+      <w:proofErr w:type="spellStart"/>
+      <w:r>
+        <w:t>ResNet</w:t>
+      </w:r>
+      <w:proofErr w:type="spellEnd"/>
+      <w:r>
+        <w:t xml:space="preserve"> — on small data, a compact on-task network rivals a large adapted one.</w:t>
+      </w:r>
+    </w:p>
+    <w:p>
+      <w:pPr>
+        <w:spacing w:after="140"/>
+        <w:ind w:firstLine="360"/>
+        <w:jc w:val="both"/>
+      </w:pPr>
+      <w:r>
+        <w:rPr>
+          <w:b/>
+          <w:bCs/>
+        </w:rPr>
+        <w:t>Where imagery is weakest.</w:t>
+      </w:r>
+      <w:r>
+        <w:t xml:space="preserve"> Dead matter (R2 0.16) and total (0.45) are the hardest for the image model; the </w:t>
+      </w:r>
+      <w:proofErr w:type="spellStart"/>
+      <w:r>
+        <w:t>RandomForest</w:t>
+      </w:r>
+      <w:proofErr w:type="spellEnd"/>
+      <w:r>
+        <w:t xml:space="preserve"> beats DINOv2 on every target. Dead biomass and scattered clover are difficult to read from a top-down photo.</w:t>
+      </w:r>
+    </w:p>
+    <w:p>
+      <w:pPr>
+        <w:spacing w:after="140"/>
+        <w:ind w:firstLine="360"/>
+        <w:jc w:val="both"/>
+      </w:pPr>
+      <w:r>
+        <w:rPr>
+          <w:b/>
+          <w:bCs/>
+        </w:rPr>
+        <w:t>Methodological note.</w:t>
+      </w:r>
+      <w:r>
+        <w:t xml:space="preserve"> Fine-tuning showed early-epoch validation instability; early stopping on validation weighted-RMSE selected the best epoch.</w:t>
+      </w:r>
+    </w:p>
+    <w:p>
+      <w:pPr>
+        <w:spacing w:after="140"/>
+        <w:ind w:firstLine="360"/>
+        <w:jc w:val="both"/>
+      </w:pPr>
+      <w:r>
+        <w:rPr>
+          <w:b/>
+          <w:bCs/>
+        </w:rPr>
+        <w:t>Interpretation.</w:t>
+      </w:r>
+      <w:r>
+        <w:t xml:space="preserve"> For this dataset and scale, the image does not add predictive value beyond cheap ground measurements. Practically, where NDVI/height are available they are the better and cheaper </w:t>
+      </w:r>
+      <w:proofErr w:type="gramStart"/>
+      <w:r>
+        <w:t>predictor</w:t>
       </w:r>
       <w:proofErr w:type="gramEnd"/>
+      <w:r>
+        <w:t>; the image-only model remains useful only in the field scenario where such measurements are unavailable, which is what the deployed app targets.</w:t>
+      </w:r>
+    </w:p>
+    <w:bookmarkEnd w:id="2"/>
+    <w:p>
+      <w:pPr>
+        <w:spacing w:after="140"/>
+        <w:ind w:firstLine="360"/>
+        <w:jc w:val="both"/>
+      </w:pPr>
+    </w:p>
+    <w:p>
+      <w:pPr>
+        <w:pStyle w:val="Heading1"/>
+        <w:ind w:firstLine="360"/>
+        <w:rPr>
+          <w:color w:val="215E99" w:themeColor="text2" w:themeTint="BF"/>
+        </w:rPr>
+      </w:pPr>
+      <w:r>
+        <w:rPr>
+          <w:color w:val="215E99" w:themeColor="text2" w:themeTint="BF"/>
+        </w:rPr>
+        <w:t>7. Deployment</w:t>
+      </w:r>
+    </w:p>
+    <w:p>
+      <w:pPr>
+        <w:spacing w:after="140"/>
+        <w:ind w:firstLine="360"/>
+        <w:jc w:val="both"/>
+      </w:pPr>
+      <w:r>
+        <w:t xml:space="preserve">A </w:t>
+      </w:r>
+      <w:proofErr w:type="spellStart"/>
+      <w:r>
+        <w:t>Gradio</w:t>
+      </w:r>
+      <w:proofErr w:type="spellEnd"/>
+      <w:r>
+        <w:t xml:space="preserve"> app (</w:t>
+      </w:r>
+      <w:proofErr w:type="spellStart"/>
+      <w:r>
+        <w:t>src</w:t>
+      </w:r>
+      <w:proofErr w:type="spellEnd"/>
+      <w:r>
+        <w:t xml:space="preserve">/app.py) serves an image-only fine-tuned </w:t>
+      </w:r>
+      <w:proofErr w:type="spellStart"/>
+      <w:r>
+        <w:t>ResNet</w:t>
+      </w:r>
+      <w:proofErr w:type="spellEnd"/>
+      <w:r>
+        <w:t>: a user uploads a quadrat photo and receives the five biomass estimates plus a short grazing-quality summary (total biomass, green share). It is deployed to Hugging Face Spaces [</w:t>
+      </w:r>
+      <w:hyperlink r:id="rId13" w:history="1">
+        <w:r>
+          <w:rPr>
+            <w:rStyle w:val="Hyperlink"/>
+          </w:rPr>
+          <w:t>link TBD</w:t>
+        </w:r>
+      </w:hyperlink>
+      <w:r>
+        <w:t>].</w:t>
+      </w:r>
+    </w:p>
+    <w:p>
+      <w:pPr>
+        <w:spacing w:after="140"/>
+        <w:ind w:firstLine="360"/>
+        <w:jc w:val="both"/>
+      </w:pPr>
+    </w:p>
+    <w:p>
+      <w:pPr>
+        <w:spacing w:after="160"/>
+        <w:ind w:firstLine="360"/>
+        <w:jc w:val="center"/>
+        <w:rPr>
+          <w:b/>
+          <w:bCs/>
+        </w:rPr>
+      </w:pPr>
+      <w:r>
+        <w:rPr>
+          <w:b/>
+          <w:bCs/>
+        </w:rPr>
+        <w:lastRenderedPageBreak/>
+        <w:drawing>
+          <wp:inline distT="0" distB="0" distL="0" distR="0" wp14:anchorId="3196FB8B" wp14:editId="7A8A3237">
+            <wp:extent cx="5731510" cy="3009265"/>
+            <wp:effectExtent l="0" t="0" r="2540" b="635"/>
+            <wp:docPr id="1331576516" name="Picture 1"/>
+            <wp:cNvGraphicFramePr>
+              <a:graphicFrameLocks xmlns:a="http://schemas.openxmlformats.org/drawingml/2006/main" noChangeAspect="1"/>
+            </wp:cNvGraphicFramePr>
+            <a:graphic xmlns:a="http://schemas.openxmlformats.org/drawingml/2006/main">
+              <a:graphicData uri="http://schemas.openxmlformats.org/drawingml/2006/picture">
+                <pic:pic xmlns:pic="http://schemas.openxmlformats.org/drawingml/2006/picture">
+                  <pic:nvPicPr>
+                    <pic:cNvPr id="1331576516" name=""/>
+                    <pic:cNvPicPr/>
+                  </pic:nvPicPr>
+                  <pic:blipFill>
+                    <a:blip r:embed="rId14"/>
+                    <a:stretch>
+                      <a:fillRect/>
+                    </a:stretch>
+                  </pic:blipFill>
+                  <pic:spPr>
+                    <a:xfrm>
+                      <a:off x="0" y="0"/>
+                      <a:ext cx="5731510" cy="3009265"/>
+                    </a:xfrm>
+                    <a:prstGeom prst="rect">
+                      <a:avLst/>
+                    </a:prstGeom>
+                  </pic:spPr>
+                </pic:pic>
+              </a:graphicData>
+            </a:graphic>
+          </wp:inline>
+        </w:drawing>
+      </w:r>
+    </w:p>
+    <w:p>
+      <w:pPr>
+        <w:spacing w:after="160"/>
+        <w:ind w:firstLine="360"/>
+        <w:jc w:val="center"/>
+      </w:pPr>
+      <w:r>
+        <w:rPr>
+          <w:b/>
+          <w:bCs/>
+        </w:rPr>
+        <w:t xml:space="preserve">Figure 6. </w:t>
+      </w:r>
       <w:r>
         <w:rPr>
           <w:i/>
           <w:iCs/>
-          <w:color w:val="808080"/>
-          <w:highlight w:val="yellow"/>
-        </w:rPr>
-        <w:t xml:space="preserve">: Hugging Face Space — screenshot after </w:t>
-      </w:r>
-      <w:proofErr w:type="gramStart"/>
+        </w:rPr>
+        <w:t xml:space="preserve">Screenshot of the deployed </w:t>
+      </w:r>
+      <w:proofErr w:type="spellStart"/>
       <w:r>
         <w:rPr>
           <w:i/>
           <w:iCs/>
-          <w:color w:val="808080"/>
-          <w:highlight w:val="yellow"/>
-        </w:rPr>
-        <w:t>deployment</w:t>
-      </w:r>
-      <w:proofErr w:type="gramEnd"/>
-    </w:p>
-    <w:p>
-      <w:pPr>
-        <w:spacing w:after="160"/>
-        <w:ind w:firstLine="360"/>
-        <w:jc w:val="center"/>
-      </w:pPr>
-      <w:r>
-        <w:rPr>
-          <w:b/>
-          <w:bCs/>
-        </w:rPr>
-        <w:t xml:space="preserve">Figure 6. </w:t>
-      </w:r>
+        </w:rPr>
+        <w:t>Gradio</w:t>
+      </w:r>
+      <w:proofErr w:type="spellEnd"/>
       <w:r>
         <w:rPr>
           <w:i/>
           <w:iCs/>
         </w:rPr>
-        <w:t xml:space="preserve">Screenshot of the deployed </w:t>
+        <w:t xml:space="preserve"> app predicting biomass from an uploaded photo.</w:t>
+      </w:r>
+    </w:p>
+    <w:p>
+      <w:pPr>
+        <w:spacing w:after="140"/>
+        <w:ind w:firstLine="360"/>
+        <w:jc w:val="both"/>
+      </w:pPr>
+      <w:r>
+        <w:t xml:space="preserve">The app deliberately uses the image-only model: it represents the realistic field scenario where a farmer has only a phone photo, not NDVI or height. This is consistent with the analysis — the demo illustrates the practical use case, while the scientific comparison lives in the report. (DINOv2 gives the best image accuracy but needs a heavier backbone; </w:t>
       </w:r>
       <w:proofErr w:type="spellStart"/>
       <w:r>
-        <w:rPr>
-          <w:i/>
-          <w:iCs/>
-        </w:rPr>
-        <w:t>Gradio</w:t>
+        <w:t>ResNet</w:t>
       </w:r>
       <w:proofErr w:type="spellEnd"/>
       <w:r>
-        <w:rPr>
-          <w:i/>
-          <w:iCs/>
-        </w:rPr>
-        <w:t xml:space="preserve"> app predicting biomass from an uploaded photo.</w:t>
-      </w:r>
-    </w:p>
-    <w:p>
-      <w:pPr>
-        <w:spacing w:after="140"/>
-        <w:ind w:firstLine="360"/>
-        <w:jc w:val="both"/>
-      </w:pPr>
-      <w:r>
-        <w:t>The app deliberately uses the image-only model: it represents the realistic field scenario where a farmer has only a phone photo, not NDVI or height. This is consistent with the analysis — the demo illustrates the practical use case, while the scientific comparison lives in the report.</w:t>
+        <w:t xml:space="preserve"> was chosen for the lightweight deployment.)</w:t>
       </w:r>
     </w:p>
     <w:p>
       <w:pPr>
         <w:pStyle w:val="Heading1"/>
         <w:ind w:firstLine="360"/>
-      </w:pPr>
-      <w:r>
+        <w:rPr>
+          <w:color w:val="215E99" w:themeColor="text2" w:themeTint="BF"/>
+        </w:rPr>
+      </w:pPr>
+      <w:r>
+        <w:rPr>
+          <w:color w:val="215E99" w:themeColor="text2" w:themeTint="BF"/>
+        </w:rPr>
         <w:t>8. Future Work</w:t>
       </w:r>
     </w:p>
     <w:p>
       <w:pPr>
-        <w:spacing w:after="140"/>
-        <w:ind w:firstLine="360"/>
-        <w:jc w:val="both"/>
-      </w:pPr>
-      <w:r>
-        <w:t xml:space="preserve">The image model underperforms metadata; promising directions to close the gap: (1) DINOv2 self-supervised features instead of ImageNet </w:t>
+        <w:ind w:firstLine="360"/>
+        <w:jc w:val="both"/>
+      </w:pPr>
+      <w:r>
+        <w:t>The image model still underperforms metadata; remaining directions:</w:t>
+      </w:r>
+    </w:p>
+    <w:p>
+      <w:pPr>
+        <w:numPr>
+          <w:ilvl w:val="0"/>
+          <w:numId w:val="2"/>
+        </w:numPr>
+        <w:jc w:val="both"/>
+      </w:pPr>
+      <w:r>
+        <w:rPr>
+          <w:b/>
+          <w:bCs/>
+        </w:rPr>
+        <w:t>Multimodal fusion</w:t>
+      </w:r>
+      <w:r>
+        <w:t xml:space="preserve"> — combine </w:t>
+      </w:r>
+      <w:proofErr w:type="gramStart"/>
+      <w:r>
+        <w:t>the DINOv2</w:t>
+      </w:r>
+      <w:proofErr w:type="gramEnd"/>
+      <w:r>
+        <w:t xml:space="preserve"> embedding with metadata; expected to beat either modality alone on the labelled set.</w:t>
+      </w:r>
+    </w:p>
+    <w:p>
+      <w:pPr>
+        <w:numPr>
+          <w:ilvl w:val="0"/>
+          <w:numId w:val="2"/>
+        </w:numPr>
+        <w:jc w:val="both"/>
+      </w:pPr>
+      <w:r>
+        <w:rPr>
+          <w:b/>
+          <w:bCs/>
+        </w:rPr>
+        <w:t xml:space="preserve">Cross-validation </w:t>
       </w:r>
       <w:proofErr w:type="spellStart"/>
       <w:r>
+        <w:rPr>
+          <w:b/>
+          <w:bCs/>
+        </w:rPr>
+        <w:t>ensembling</w:t>
+      </w:r>
+      <w:proofErr w:type="spellEnd"/>
+      <w:r>
+        <w:t xml:space="preserve"> and </w:t>
+      </w:r>
+      <w:r>
+        <w:rPr>
+          <w:b/>
+          <w:bCs/>
+        </w:rPr>
+        <w:t>test-time augmentation</w:t>
+      </w:r>
+      <w:r>
+        <w:t xml:space="preserve"> for cheap, low-risk gains.</w:t>
+      </w:r>
+    </w:p>
+    <w:p>
+      <w:pPr>
+        <w:numPr>
+          <w:ilvl w:val="0"/>
+          <w:numId w:val="2"/>
+        </w:numPr>
+        <w:jc w:val="both"/>
+      </w:pPr>
+      <w:r>
+        <w:rPr>
+          <w:b/>
+          <w:bCs/>
+        </w:rPr>
+        <w:t>Domain-specific pretraining</w:t>
+      </w:r>
+      <w:r>
+        <w:t xml:space="preserve"> — continue pretraining the backbone on vegetation/pasture imagery before fine-tuning.</w:t>
+      </w:r>
+    </w:p>
+    <w:p>
+      <w:pPr>
+        <w:ind w:firstLine="360"/>
+        <w:jc w:val="both"/>
+      </w:pPr>
+      <w:r>
+        <w:t xml:space="preserve">Note: DINOv2 self-supervised features (originally proposed as future work) were implemented and are reported above — they gave the best image model (16.50), far above the ImageNet </w:t>
+      </w:r>
+      <w:proofErr w:type="spellStart"/>
+      <w:r>
         <w:t>ResNet</w:t>
       </w:r>
       <w:proofErr w:type="spellEnd"/>
       <w:r>
-        <w:t xml:space="preserve"> — features learned on vast </w:t>
+        <w:t xml:space="preserve"> baseline.</w:t>
+      </w:r>
+    </w:p>
+    <w:p>
+      <w:pPr>
+        <w:pStyle w:val="Heading1"/>
+        <w:ind w:firstLine="360"/>
+        <w:rPr>
+          <w:color w:val="215E99" w:themeColor="text2" w:themeTint="BF"/>
+        </w:rPr>
+      </w:pPr>
+      <w:r>
+        <w:rPr>
+          <w:color w:val="215E99" w:themeColor="text2" w:themeTint="BF"/>
+        </w:rPr>
+        <w:t>9. References</w:t>
+      </w:r>
+    </w:p>
+    <w:p>
+      <w:pPr>
+        <w:numPr>
+          <w:ilvl w:val="0"/>
+          <w:numId w:val="3"/>
+        </w:numPr>
+        <w:spacing w:after="140"/>
+        <w:jc w:val="both"/>
+      </w:pPr>
+      <w:r>
+        <w:t xml:space="preserve">Sebastian Raschka et al., “Machine Learning with </w:t>
       </w:r>
       <w:proofErr w:type="spellStart"/>
       <w:r>
-        <w:t>unlabelled</w:t>
+        <w:t>PyTorch</w:t>
       </w:r>
       <w:proofErr w:type="spellEnd"/>
       <w:r>
-        <w:t xml:space="preserve"> data may transfer better to pasture texture; (2) a segmentation approach — predict green/dead/soil masks, then derive component fractions, closer to how an agronomist assesses a sward; (3) multimodal fusion — combine image + metadata, expected to beat either modality alone on the labelled set; (4) cross-validation </w:t>
+        <w:t xml:space="preserve"> and Scikit-Learn”, 2022.</w:t>
+      </w:r>
+    </w:p>
+    <w:p>
+      <w:pPr>
+        <w:numPr>
+          <w:ilvl w:val="0"/>
+          <w:numId w:val="3"/>
+        </w:numPr>
+        <w:spacing w:after="140"/>
+        <w:jc w:val="both"/>
+      </w:pPr>
+      <w:r>
+        <w:t>CSIRO Image2Biomass dataset (Kaggle competition).</w:t>
+      </w:r>
+    </w:p>
+    <w:p>
+      <w:pPr>
+        <w:numPr>
+          <w:ilvl w:val="0"/>
+          <w:numId w:val="3"/>
+        </w:numPr>
+        <w:spacing w:after="140"/>
+        <w:jc w:val="both"/>
+      </w:pPr>
+      <w:r>
+        <w:t>He et al., "Deep Residual Learning for Image Recognition" (</w:t>
       </w:r>
       <w:proofErr w:type="spellStart"/>
       <w:r>
-        <w:t>ensembling</w:t>
+        <w:t>ResNet</w:t>
       </w:r>
       <w:proofErr w:type="spellEnd"/>
       <w:r>
-        <w:t xml:space="preserve"> and test-time augmentation for cheap, low-risk gains.</w:t>
+        <w:t>), 2016.</w:t>
+      </w:r>
+    </w:p>
+    <w:p>
+      <w:pPr>
+        <w:numPr>
+          <w:ilvl w:val="0"/>
+          <w:numId w:val="3"/>
+        </w:numPr>
+        <w:spacing w:after="140"/>
+        <w:jc w:val="both"/>
+      </w:pPr>
+      <w:proofErr w:type="spellStart"/>
+      <w:r>
+        <w:t>Oquab</w:t>
+      </w:r>
+      <w:proofErr w:type="spellEnd"/>
+      <w:r>
+        <w:t xml:space="preserve"> et al., "DINOv2: Learning Robust Visual Features without Supervision", 2023.</w:t>
+      </w:r>
+    </w:p>
+    <w:p>
+      <w:pPr>
+        <w:numPr>
+          <w:ilvl w:val="0"/>
+          <w:numId w:val="3"/>
+        </w:numPr>
+        <w:spacing w:after="140"/>
+        <w:jc w:val="both"/>
+      </w:pPr>
+      <w:r>
+        <w:t>Pedregosa et al., "Scikit-learn: Machine Learning in Python", JMLR 2011.</w:t>
+      </w:r>
+    </w:p>
+    <w:p>
+      <w:pPr>
+        <w:numPr>
+          <w:ilvl w:val="0"/>
+          <w:numId w:val="3"/>
+        </w:numPr>
+        <w:spacing w:after="140"/>
+        <w:jc w:val="both"/>
+      </w:pPr>
+      <w:proofErr w:type="spellStart"/>
+      <w:r>
+        <w:t>Paszke</w:t>
+      </w:r>
+      <w:proofErr w:type="spellEnd"/>
+      <w:r>
+        <w:t xml:space="preserve"> et al., "</w:t>
+      </w:r>
+      <w:proofErr w:type="spellStart"/>
+      <w:r>
+        <w:t>PyTorch</w:t>
+      </w:r>
+      <w:proofErr w:type="spellEnd"/>
+      <w:r>
+        <w:t xml:space="preserve">", </w:t>
+      </w:r>
+      <w:proofErr w:type="spellStart"/>
+      <w:r>
+        <w:t>NeurIPS</w:t>
+      </w:r>
+      <w:proofErr w:type="spellEnd"/>
+      <w:r>
+        <w:t xml:space="preserve"> 2019.</w:t>
       </w:r>
     </w:p>
     <w:p>
       <w:pPr>
         <w:pStyle w:val="Heading1"/>
         <w:ind w:firstLine="360"/>
-      </w:pPr>
-      <w:r>
-        <w:t>9. References</w:t>
-      </w:r>
-    </w:p>
-    <w:p>
-      <w:pPr>
-        <w:spacing w:after="140"/>
-        <w:ind w:firstLine="360"/>
-        <w:jc w:val="both"/>
-        <w:rPr>
-          <w:highlight w:val="yellow"/>
-        </w:rPr>
-      </w:pPr>
-      <w:r>
-        <w:rPr>
-          <w:highlight w:val="yellow"/>
-        </w:rPr>
-        <w:t xml:space="preserve">CSIRO Image2Biomass dataset (Kaggle competition). </w:t>
-      </w:r>
-    </w:p>
-    <w:p>
-      <w:pPr>
-        <w:spacing w:after="140"/>
-        <w:ind w:firstLine="360"/>
-        <w:jc w:val="both"/>
-        <w:rPr>
-          <w:highlight w:val="yellow"/>
-        </w:rPr>
-      </w:pPr>
-      <w:r>
-        <w:rPr>
-          <w:highlight w:val="yellow"/>
-        </w:rPr>
-        <w:t>He et al., "Deep Residual Learning for Image Recognition" (</w:t>
-      </w:r>
-      <w:proofErr w:type="spellStart"/>
-      <w:r>
-        <w:rPr>
-          <w:highlight w:val="yellow"/>
-        </w:rPr>
-        <w:t>ResNet</w:t>
-      </w:r>
-      <w:proofErr w:type="spellEnd"/>
-      <w:r>
-        <w:rPr>
-          <w:highlight w:val="yellow"/>
-        </w:rPr>
-        <w:t xml:space="preserve">), 2016. </w:t>
-      </w:r>
-    </w:p>
-    <w:p>
-      <w:pPr>
-        <w:spacing w:after="140"/>
-        <w:ind w:firstLine="360"/>
-        <w:jc w:val="both"/>
-        <w:rPr>
-          <w:highlight w:val="yellow"/>
-        </w:rPr>
-      </w:pPr>
-      <w:r>
-        <w:rPr>
-          <w:highlight w:val="yellow"/>
-        </w:rPr>
-        <w:t xml:space="preserve">Pedregosa et al., "Scikit-learn: Machine Learning in Python", JMLR 2011. </w:t>
-      </w:r>
-    </w:p>
-    <w:p>
-      <w:pPr>
-        <w:spacing w:after="140"/>
-        <w:ind w:firstLine="360"/>
-        <w:jc w:val="both"/>
-      </w:pPr>
-      <w:proofErr w:type="spellStart"/>
-      <w:r>
-        <w:rPr>
-          <w:highlight w:val="yellow"/>
-        </w:rPr>
-        <w:t>Paszke</w:t>
-      </w:r>
-      <w:proofErr w:type="spellEnd"/>
-      <w:r>
-        <w:rPr>
-          <w:highlight w:val="yellow"/>
-        </w:rPr>
-        <w:t xml:space="preserve"> et al., "</w:t>
-      </w:r>
-      <w:proofErr w:type="spellStart"/>
-      <w:r>
-        <w:rPr>
-          <w:highlight w:val="yellow"/>
-        </w:rPr>
-        <w:t>PyTorch</w:t>
-      </w:r>
-      <w:proofErr w:type="spellEnd"/>
-      <w:r>
-        <w:rPr>
-          <w:highlight w:val="yellow"/>
-        </w:rPr>
-        <w:t xml:space="preserve">", </w:t>
-      </w:r>
-      <w:proofErr w:type="spellStart"/>
-      <w:r>
-        <w:rPr>
-          <w:highlight w:val="yellow"/>
-        </w:rPr>
-        <w:t>NeurIPS</w:t>
-      </w:r>
-      <w:proofErr w:type="spellEnd"/>
-      <w:r>
-        <w:rPr>
-          <w:highlight w:val="yellow"/>
-        </w:rPr>
-        <w:t xml:space="preserve"> 2019. [Add any other sources used.]</w:t>
-      </w:r>
-    </w:p>
-    <w:p>
-      <w:pPr>
-        <w:pStyle w:val="Heading1"/>
-        <w:ind w:firstLine="360"/>
-      </w:pPr>
-      <w:r>
+        <w:rPr>
+          <w:color w:val="215E99" w:themeColor="text2" w:themeTint="BF"/>
+        </w:rPr>
+      </w:pPr>
+      <w:r>
+        <w:rPr>
+          <w:color w:val="215E99" w:themeColor="text2" w:themeTint="BF"/>
+        </w:rPr>
         <w:t>10. Contributions</w:t>
       </w:r>
     </w:p>
     <w:p>
       <w:pPr>
         <w:spacing w:after="140"/>
-        <w:ind w:firstLine="360"/>
-        <w:jc w:val="both"/>
-      </w:pPr>
-      <w:r>
-        <w:t>[Name 1]: [</w:t>
-      </w:r>
-      <w:proofErr w:type="gramStart"/>
-      <w:r>
-        <w:t>e.g.</w:t>
-      </w:r>
-      <w:proofErr w:type="gramEnd"/>
-      <w:r>
-        <w:t xml:space="preserve"> EDA, tabular baseline, report.] [Name 2]: [</w:t>
-      </w:r>
-      <w:proofErr w:type="gramStart"/>
-      <w:r>
-        <w:t>e.g.</w:t>
-      </w:r>
-      <w:proofErr w:type="gramEnd"/>
-      <w:r>
-        <w:t xml:space="preserve"> CNN pipeline, training, deployment.] (Fill in per actual division of work.)</w:t>
-      </w:r>
+        <w:ind w:left="720"/>
+        <w:jc w:val="both"/>
+      </w:pPr>
+      <w:r>
+        <w:rPr>
+          <w:b/>
+          <w:bCs/>
+        </w:rPr>
+        <w:t>[Xavier Loreto]:</w:t>
+      </w:r>
+      <w:r>
+        <w:t xml:space="preserve"> [e.g. EDA, tabular baseline, report.]</w:t>
+      </w:r>
+    </w:p>
+    <w:p>
+      <w:pPr>
+        <w:spacing w:after="140"/>
+        <w:ind w:left="720"/>
+        <w:jc w:val="both"/>
+      </w:pPr>
+      <w:r>
+        <w:rPr>
+          <w:b/>
+          <w:bCs/>
+        </w:rPr>
+        <w:t>[Shuhrat Maksumov]:</w:t>
+      </w:r>
+      <w:r>
+        <w:t xml:space="preserve"> [e.g. CNN pipeline, DINOv2, deployment.]</w:t>
+      </w:r>
+    </w:p>
+    <w:p>
+      <w:pPr>
+        <w:spacing w:after="140"/>
+        <w:ind w:left="720"/>
+        <w:jc w:val="both"/>
+      </w:pPr>
     </w:p>
     <w:sectPr>
-      <w:footerReference w:type="default" r:id="rId13"/>
+      <w:footerReference w:type="default" r:id="rId15"/>
       <w:pgSz w:w="11906" w:h="16838"/>
       <w:pgMar w:top="1440" w:right="1440" w:bottom="1440" w:left="1440" w:header="708" w:footer="708" w:gutter="0"/>
       <w:cols w:space="720"/>
@@ -2215,6 +2661,83 @@
 <file path=word/numbering.xml><?xml version="1.0" encoding="utf-8"?>
 <w:numbering xmlns:wpc="http://schemas.microsoft.com/office/word/2010/wordprocessingCanvas" xmlns:cx="http://schemas.microsoft.com/office/drawing/2014/chartex" xmlns:cx1="http://schemas.microsoft.com/office/drawing/2015/9/8/chartex" xmlns:cx2="http://schemas.microsoft.com/office/drawing/2015/10/21/chartex" xmlns:cx3="http://schemas.microsoft.com/office/drawing/2016/5/9/chartex" xmlns:cx4="http://schemas.microsoft.com/office/drawing/2016/5/10/chartex" xmlns:cx5="http://schemas.microsoft.com/office/drawing/2016/5/11/chartex" xmlns:cx6="http://schemas.microsoft.com/office/drawing/2016/5/12/chartex" xmlns:cx7="http://schemas.microsoft.com/office/drawing/2016/5/13/chartex" xmlns:cx8="http://schemas.microsoft.com/office/drawing/2016/5/14/chartex" xmlns:mc="http://schemas.openxmlformats.org/markup-compatibility/2006" xmlns:aink="http://schemas.microsoft.com/office/drawing/2016/ink" xmlns:am3d="http://schemas.microsoft.com/office/drawing/2017/model3d" xmlns:o="urn:schemas-microsoft-com:office:office" xmlns:oel="http://schemas.microsoft.com/office/2019/extlst" xmlns:r="http://schemas.openxmlformats.org/officeDocument/2006/relationships" xmlns:m="http://schemas.openxmlformats.org/officeDocument/2006/math" xmlns:v="urn:schemas-microsoft-com:vml" xmlns:wp14="http://schemas.microsoft.com/office/word/2010/wordprocessingDrawing" xmlns:wp="http://schemas.openxmlformats.org/drawingml/2006/wordprocessingDrawing" xmlns:w10="urn:schemas-microsoft-com:office:word" xmlns:w="http://schemas.openxmlformats.org/wordprocessingml/2006/main" xmlns:w14="http://schemas.microsoft.com/office/word/2010/wordml" xmlns:w15="http://schemas.microsoft.com/office/word/2012/wordml" xmlns:w16cex="http://schemas.microsoft.com/office/word/2018/wordml/cex" xmlns:w16cid="http://schemas.microsoft.com/office/word/2016/wordml/cid" xmlns:w16="http://schemas.microsoft.com/office/word/2018/wordml" xmlns:w16du="http://schemas.microsoft.com/office/word/2023/wordml/word16du" xmlns:w16sdtdh="http://schemas.microsoft.com/office/word/2020/wordml/sdtdatahash" xmlns:w16sdtfl="http://schemas.microsoft.com/office/word/2024/wordml/sdtformatlock" xmlns:w16se="http://schemas.microsoft.com/office/word/2015/wordml/symex" xmlns:wpg="http://schemas.microsoft.com/office/word/2010/wordprocessingGroup" xmlns:wpi="http://schemas.microsoft.com/office/word/2010/wordprocessingInk" xmlns:wne="http://schemas.microsoft.com/office/word/2006/wordml" xmlns:wps="http://schemas.microsoft.com/office/word/2010/wordprocessingShape" mc:Ignorable="w14 w15 w16se w16cid w16 w16cex w16sdtdh w16sdtfl w16du wp14">
   <w:abstractNum w:abstractNumId="0" w15:restartNumberingAfterBreak="0">
+    <w:nsid w:val="0000A991"/>
+    <w:multiLevelType w:val="multilevel"/>
+    <w:tmpl w:val="5FE68576"/>
+    <w:lvl w:ilvl="0">
+      <w:numFmt w:val="bullet"/>
+      <w:lvlText w:val="•"/>
+      <w:lvlJc w:val="left"/>
+      <w:pPr>
+        <w:ind w:left="930" w:hanging="480"/>
+      </w:pPr>
+    </w:lvl>
+    <w:lvl w:ilvl="1">
+      <w:numFmt w:val="bullet"/>
+      <w:lvlText w:val="–"/>
+      <w:lvlJc w:val="left"/>
+      <w:pPr>
+        <w:ind w:left="1440" w:hanging="480"/>
+      </w:pPr>
+    </w:lvl>
+    <w:lvl w:ilvl="2">
+      <w:numFmt w:val="bullet"/>
+      <w:lvlText w:val="•"/>
+      <w:lvlJc w:val="left"/>
+      <w:pPr>
+        <w:ind w:left="2160" w:hanging="480"/>
+      </w:pPr>
+    </w:lvl>
+    <w:lvl w:ilvl="3">
+      <w:numFmt w:val="bullet"/>
+      <w:lvlText w:val="–"/>
+      <w:lvlJc w:val="left"/>
+      <w:pPr>
+        <w:ind w:left="2880" w:hanging="480"/>
+      </w:pPr>
+    </w:lvl>
+    <w:lvl w:ilvl="4">
+      <w:numFmt w:val="bullet"/>
+      <w:lvlText w:val="•"/>
+      <w:lvlJc w:val="left"/>
+      <w:pPr>
+        <w:ind w:left="3600" w:hanging="480"/>
+      </w:pPr>
+    </w:lvl>
+    <w:lvl w:ilvl="5">
+      <w:numFmt w:val="bullet"/>
+      <w:lvlText w:val="–"/>
+      <w:lvlJc w:val="left"/>
+      <w:pPr>
+        <w:ind w:left="4320" w:hanging="480"/>
+      </w:pPr>
+    </w:lvl>
+    <w:lvl w:ilvl="6">
+      <w:numFmt w:val="bullet"/>
+      <w:lvlText w:val="•"/>
+      <w:lvlJc w:val="left"/>
+      <w:pPr>
+        <w:ind w:left="5040" w:hanging="480"/>
+      </w:pPr>
+    </w:lvl>
+    <w:lvl w:ilvl="7">
+      <w:numFmt w:val="bullet"/>
+      <w:lvlText w:val="–"/>
+      <w:lvlJc w:val="left"/>
+      <w:pPr>
+        <w:ind w:left="5760" w:hanging="480"/>
+      </w:pPr>
+    </w:lvl>
+    <w:lvl w:ilvl="8">
+      <w:numFmt w:val="bullet"/>
+      <w:lvlText w:val="•"/>
+      <w:lvlJc w:val="left"/>
+      <w:pPr>
+        <w:ind w:left="6480" w:hanging="480"/>
+      </w:pPr>
+    </w:lvl>
+  </w:abstractNum>
+  <w:abstractNum w:abstractNumId="1" w15:restartNumberingAfterBreak="0">
     <w:nsid w:val="40ED0258"/>
     <w:multiLevelType w:val="hybridMultilevel"/>
     <w:tmpl w:val="63E8503C"/>
@@ -2300,11 +2823,95 @@
       </w:pPr>
     </w:lvl>
   </w:abstractNum>
+  <w:abstractNum w:abstractNumId="2" w15:restartNumberingAfterBreak="0">
+    <w:nsid w:val="4DE749AB"/>
+    <w:multiLevelType w:val="multilevel"/>
+    <w:tmpl w:val="5C36F008"/>
+    <w:lvl w:ilvl="0">
+      <w:start w:val="1"/>
+      <w:numFmt w:val="decimal"/>
+      <w:lvlText w:val="%1."/>
+      <w:lvlJc w:val="left"/>
+      <w:pPr>
+        <w:ind w:left="930" w:hanging="480"/>
+      </w:pPr>
+    </w:lvl>
+    <w:lvl w:ilvl="1">
+      <w:numFmt w:val="bullet"/>
+      <w:lvlText w:val="–"/>
+      <w:lvlJc w:val="left"/>
+      <w:pPr>
+        <w:ind w:left="1440" w:hanging="480"/>
+      </w:pPr>
+    </w:lvl>
+    <w:lvl w:ilvl="2">
+      <w:numFmt w:val="bullet"/>
+      <w:lvlText w:val="•"/>
+      <w:lvlJc w:val="left"/>
+      <w:pPr>
+        <w:ind w:left="2160" w:hanging="480"/>
+      </w:pPr>
+    </w:lvl>
+    <w:lvl w:ilvl="3">
+      <w:numFmt w:val="bullet"/>
+      <w:lvlText w:val="–"/>
+      <w:lvlJc w:val="left"/>
+      <w:pPr>
+        <w:ind w:left="2880" w:hanging="480"/>
+      </w:pPr>
+    </w:lvl>
+    <w:lvl w:ilvl="4">
+      <w:numFmt w:val="bullet"/>
+      <w:lvlText w:val="•"/>
+      <w:lvlJc w:val="left"/>
+      <w:pPr>
+        <w:ind w:left="3600" w:hanging="480"/>
+      </w:pPr>
+    </w:lvl>
+    <w:lvl w:ilvl="5">
+      <w:numFmt w:val="bullet"/>
+      <w:lvlText w:val="–"/>
+      <w:lvlJc w:val="left"/>
+      <w:pPr>
+        <w:ind w:left="4320" w:hanging="480"/>
+      </w:pPr>
+    </w:lvl>
+    <w:lvl w:ilvl="6">
+      <w:numFmt w:val="bullet"/>
+      <w:lvlText w:val="•"/>
+      <w:lvlJc w:val="left"/>
+      <w:pPr>
+        <w:ind w:left="5040" w:hanging="480"/>
+      </w:pPr>
+    </w:lvl>
+    <w:lvl w:ilvl="7">
+      <w:numFmt w:val="bullet"/>
+      <w:lvlText w:val="–"/>
+      <w:lvlJc w:val="left"/>
+      <w:pPr>
+        <w:ind w:left="5760" w:hanging="480"/>
+      </w:pPr>
+    </w:lvl>
+    <w:lvl w:ilvl="8">
+      <w:numFmt w:val="bullet"/>
+      <w:lvlText w:val="•"/>
+      <w:lvlJc w:val="left"/>
+      <w:pPr>
+        <w:ind w:left="6480" w:hanging="480"/>
+      </w:pPr>
+    </w:lvl>
+  </w:abstractNum>
   <w:num w:numId="1" w16cid:durableId="965312248">
-    <w:abstractNumId w:val="0"/>
+    <w:abstractNumId w:val="1"/>
     <w:lvlOverride w:ilvl="0">
       <w:startOverride w:val="1"/>
     </w:lvlOverride>
+  </w:num>
+  <w:num w:numId="2" w16cid:durableId="2135170386">
+    <w:abstractNumId w:val="0"/>
+  </w:num>
+  <w:num w:numId="3" w16cid:durableId="1822040000">
+    <w:abstractNumId w:val="2"/>
   </w:num>
 </w:numbering>
 </file>
@@ -3198,6 +3805,139 @@
     <w:uiPriority w:val="99"/>
     <w:rsid w:val="00830403"/>
   </w:style>
+  <w:style w:type="table" w:styleId="ListTable3-Accent4">
+    <w:name w:val="List Table 3 Accent 4"/>
+    <w:basedOn w:val="TableNormal"/>
+    <w:uiPriority w:val="48"/>
+    <w:rsid w:val="00DB428F"/>
+    <w:tblPr>
+      <w:tblStyleRowBandSize w:val="1"/>
+      <w:tblStyleColBandSize w:val="1"/>
+      <w:tblBorders>
+        <w:top w:val="single" w:sz="4" w:space="0" w:color="0F9ED5" w:themeColor="accent4"/>
+        <w:left w:val="single" w:sz="4" w:space="0" w:color="0F9ED5" w:themeColor="accent4"/>
+        <w:bottom w:val="single" w:sz="4" w:space="0" w:color="0F9ED5" w:themeColor="accent4"/>
+        <w:right w:val="single" w:sz="4" w:space="0" w:color="0F9ED5" w:themeColor="accent4"/>
+      </w:tblBorders>
+    </w:tblPr>
+    <w:tblStylePr w:type="firstRow">
+      <w:rPr>
+        <w:b/>
+        <w:bCs/>
+        <w:color w:val="FFFFFF" w:themeColor="background1"/>
+      </w:rPr>
+      <w:tblPr/>
+      <w:tcPr>
+        <w:shd w:val="clear" w:color="auto" w:fill="0F9ED5" w:themeFill="accent4"/>
+      </w:tcPr>
+    </w:tblStylePr>
+    <w:tblStylePr w:type="lastRow">
+      <w:rPr>
+        <w:b/>
+        <w:bCs/>
+      </w:rPr>
+      <w:tblPr/>
+      <w:tcPr>
+        <w:tcBorders>
+          <w:top w:val="double" w:sz="4" w:space="0" w:color="0F9ED5" w:themeColor="accent4"/>
+        </w:tcBorders>
+        <w:shd w:val="clear" w:color="auto" w:fill="FFFFFF" w:themeFill="background1"/>
+      </w:tcPr>
+    </w:tblStylePr>
+    <w:tblStylePr w:type="firstCol">
+      <w:rPr>
+        <w:b/>
+        <w:bCs/>
+      </w:rPr>
+      <w:tblPr/>
+      <w:tcPr>
+        <w:tcBorders>
+          <w:right w:val="nil"/>
+        </w:tcBorders>
+        <w:shd w:val="clear" w:color="auto" w:fill="FFFFFF" w:themeFill="background1"/>
+      </w:tcPr>
+    </w:tblStylePr>
+    <w:tblStylePr w:type="lastCol">
+      <w:rPr>
+        <w:b/>
+        <w:bCs/>
+      </w:rPr>
+      <w:tblPr/>
+      <w:tcPr>
+        <w:tcBorders>
+          <w:left w:val="nil"/>
+        </w:tcBorders>
+        <w:shd w:val="clear" w:color="auto" w:fill="FFFFFF" w:themeFill="background1"/>
+      </w:tcPr>
+    </w:tblStylePr>
+    <w:tblStylePr w:type="band1Vert">
+      <w:tblPr/>
+      <w:tcPr>
+        <w:tcBorders>
+          <w:left w:val="single" w:sz="4" w:space="0" w:color="0F9ED5" w:themeColor="accent4"/>
+          <w:right w:val="single" w:sz="4" w:space="0" w:color="0F9ED5" w:themeColor="accent4"/>
+        </w:tcBorders>
+      </w:tcPr>
+    </w:tblStylePr>
+    <w:tblStylePr w:type="band1Horz">
+      <w:tblPr/>
+      <w:tcPr>
+        <w:tcBorders>
+          <w:top w:val="single" w:sz="4" w:space="0" w:color="0F9ED5" w:themeColor="accent4"/>
+          <w:bottom w:val="single" w:sz="4" w:space="0" w:color="0F9ED5" w:themeColor="accent4"/>
+          <w:insideH w:val="nil"/>
+        </w:tcBorders>
+      </w:tcPr>
+    </w:tblStylePr>
+    <w:tblStylePr w:type="neCell">
+      <w:tblPr/>
+      <w:tcPr>
+        <w:tcBorders>
+          <w:left w:val="nil"/>
+          <w:bottom w:val="nil"/>
+        </w:tcBorders>
+      </w:tcPr>
+    </w:tblStylePr>
+    <w:tblStylePr w:type="nwCell">
+      <w:tblPr/>
+      <w:tcPr>
+        <w:tcBorders>
+          <w:bottom w:val="nil"/>
+          <w:right w:val="nil"/>
+        </w:tcBorders>
+      </w:tcPr>
+    </w:tblStylePr>
+    <w:tblStylePr w:type="seCell">
+      <w:tblPr/>
+      <w:tcPr>
+        <w:tcBorders>
+          <w:top w:val="double" w:sz="4" w:space="0" w:color="0F9ED5" w:themeColor="accent4"/>
+          <w:left w:val="nil"/>
+        </w:tcBorders>
+      </w:tcPr>
+    </w:tblStylePr>
+    <w:tblStylePr w:type="swCell">
+      <w:tblPr/>
+      <w:tcPr>
+        <w:tcBorders>
+          <w:top w:val="double" w:sz="4" w:space="0" w:color="0F9ED5" w:themeColor="accent4"/>
+          <w:right w:val="nil"/>
+        </w:tcBorders>
+      </w:tcPr>
+    </w:tblStylePr>
+  </w:style>
+  <w:style w:type="character" w:styleId="UnresolvedMention">
+    <w:name w:val="Unresolved Mention"/>
+    <w:basedOn w:val="DefaultParagraphFont"/>
+    <w:uiPriority w:val="99"/>
+    <w:semiHidden/>
+    <w:unhideWhenUsed/>
+    <w:rsid w:val="00752F4E"/>
+    <w:rPr>
+      <w:color w:val="605E5C"/>
+      <w:shd w:val="clear" w:color="auto" w:fill="E1DFDD"/>
+    </w:rPr>
+  </w:style>
 </w:styles>
 </file>
 

</xml_diff>